<commit_message>
Aponta o app para a nuvem e registra no documento os achados da implantacao
Aplicativo:
- Passa a consumir a instancia em producao (lumina-sd21), dispensando a
  API no computador e a mesma rede Wi-Fi; o endereco anterior era o do
  servico suspenso do PIM III.
- Tempo limite de 15 s para 60 s: o plano gratuito leva ~50 s para
  acordar, e o primeiro acesso falhava.
- Dispara a verificacao de saude na abertura, acordando o servidor
  enquanto o usuario digita as credenciais.

Documento (mantido em 30 paginas):
- 8.7: conflito entre gatilhos e o UPDATE ... OUTPUT do EF Core.
- 9.7: senha de administrador vazada, substituida e verificada.
- 6.6 e 6.8: aplicativo em nuvem e novo tempo limite.

Co-Authored-By: Claude Opus 5.5 <noreply@anthropic.com>
</commit_message>
<xml_diff>
--- a/docs/PIM_IV_documento.docx
+++ b/docs/PIM_IV_documento.docx
@@ -15,7 +15,7 @@
           <w:noProof/>
         </w:rPr>
         <w:drawing>
-          <wp:inline distT="0" distB="0" distL="0" distR="0" wp14:anchorId="697222E5" wp14:editId="325A3D01">
+          <wp:inline distT="0" distB="0" distL="0" distR="0" wp14:anchorId="0AE4D770" wp14:editId="73864AA9">
             <wp:extent cx="1980000" cy="699722"/>
             <wp:effectExtent l="0" t="0" r="1270" b="5715"/>
             <wp:docPr id="1" name="Imagem 1"/>
@@ -458,7 +458,7 @@
         <w:rPr>
           <w:noProof/>
         </w:rPr>
-        <w:instrText xml:space="preserve"> PAGEREF _Toc241225191 \h </w:instrText>
+        <w:instrText xml:space="preserve"> PAGEREF _Toc241227251 \h </w:instrText>
       </w:r>
       <w:r>
         <w:rPr>
@@ -519,7 +519,7 @@
         <w:rPr>
           <w:noProof/>
         </w:rPr>
-        <w:instrText xml:space="preserve"> PAGEREF _Toc241225192 \h </w:instrText>
+        <w:instrText xml:space="preserve"> PAGEREF _Toc241227252 \h </w:instrText>
       </w:r>
       <w:r>
         <w:rPr>
@@ -580,7 +580,7 @@
         <w:rPr>
           <w:noProof/>
         </w:rPr>
-        <w:instrText xml:space="preserve"> PAGEREF _Toc241225193 \h </w:instrText>
+        <w:instrText xml:space="preserve"> PAGEREF _Toc241227253 \h </w:instrText>
       </w:r>
       <w:r>
         <w:rPr>
@@ -641,7 +641,7 @@
         <w:rPr>
           <w:noProof/>
         </w:rPr>
-        <w:instrText xml:space="preserve"> PAGEREF _Toc241225194 \h </w:instrText>
+        <w:instrText xml:space="preserve"> PAGEREF _Toc241227254 \h </w:instrText>
       </w:r>
       <w:r>
         <w:rPr>
@@ -702,7 +702,7 @@
         <w:rPr>
           <w:noProof/>
         </w:rPr>
-        <w:instrText xml:space="preserve"> PAGEREF _Toc241225195 \h </w:instrText>
+        <w:instrText xml:space="preserve"> PAGEREF _Toc241227255 \h </w:instrText>
       </w:r>
       <w:r>
         <w:rPr>
@@ -763,7 +763,7 @@
         <w:rPr>
           <w:noProof/>
         </w:rPr>
-        <w:instrText xml:space="preserve"> PAGEREF _Toc241225196 \h </w:instrText>
+        <w:instrText xml:space="preserve"> PAGEREF _Toc241227256 \h </w:instrText>
       </w:r>
       <w:r>
         <w:rPr>
@@ -824,7 +824,7 @@
         <w:rPr>
           <w:noProof/>
         </w:rPr>
-        <w:instrText xml:space="preserve"> PAGEREF _Toc241225197 \h </w:instrText>
+        <w:instrText xml:space="preserve"> PAGEREF _Toc241227257 \h </w:instrText>
       </w:r>
       <w:r>
         <w:rPr>
@@ -885,7 +885,7 @@
         <w:rPr>
           <w:noProof/>
         </w:rPr>
-        <w:instrText xml:space="preserve"> PAGEREF _Toc241225198 \h </w:instrText>
+        <w:instrText xml:space="preserve"> PAGEREF _Toc241227258 \h </w:instrText>
       </w:r>
       <w:r>
         <w:rPr>
@@ -946,7 +946,7 @@
         <w:rPr>
           <w:noProof/>
         </w:rPr>
-        <w:instrText xml:space="preserve"> PAGEREF _Toc241225199 \h </w:instrText>
+        <w:instrText xml:space="preserve"> PAGEREF _Toc241227259 \h </w:instrText>
       </w:r>
       <w:r>
         <w:rPr>
@@ -1007,7 +1007,7 @@
         <w:rPr>
           <w:noProof/>
         </w:rPr>
-        <w:instrText xml:space="preserve"> PAGEREF _Toc241225200 \h </w:instrText>
+        <w:instrText xml:space="preserve"> PAGEREF _Toc241227260 \h </w:instrText>
       </w:r>
       <w:r>
         <w:rPr>
@@ -1068,7 +1068,7 @@
         <w:rPr>
           <w:noProof/>
         </w:rPr>
-        <w:instrText xml:space="preserve"> PAGEREF _Toc241225201 \h </w:instrText>
+        <w:instrText xml:space="preserve"> PAGEREF _Toc241227261 \h </w:instrText>
       </w:r>
       <w:r>
         <w:rPr>
@@ -1129,7 +1129,7 @@
         <w:rPr>
           <w:noProof/>
         </w:rPr>
-        <w:instrText xml:space="preserve"> PAGEREF _Toc241225202 \h </w:instrText>
+        <w:instrText xml:space="preserve"> PAGEREF _Toc241227262 \h </w:instrText>
       </w:r>
       <w:r>
         <w:rPr>
@@ -1190,7 +1190,7 @@
         <w:rPr>
           <w:noProof/>
         </w:rPr>
-        <w:instrText xml:space="preserve"> PAGEREF _Toc241225203 \h </w:instrText>
+        <w:instrText xml:space="preserve"> PAGEREF _Toc241227263 \h </w:instrText>
       </w:r>
       <w:r>
         <w:rPr>
@@ -1251,7 +1251,7 @@
         <w:rPr>
           <w:noProof/>
         </w:rPr>
-        <w:instrText xml:space="preserve"> PAGEREF _Toc241225204 \h </w:instrText>
+        <w:instrText xml:space="preserve"> PAGEREF _Toc241227264 \h </w:instrText>
       </w:r>
       <w:r>
         <w:rPr>
@@ -1312,7 +1312,7 @@
         <w:rPr>
           <w:noProof/>
         </w:rPr>
-        <w:instrText xml:space="preserve"> PAGEREF _Toc241225205 \h </w:instrText>
+        <w:instrText xml:space="preserve"> PAGEREF _Toc241227265 \h </w:instrText>
       </w:r>
       <w:r>
         <w:rPr>
@@ -1373,7 +1373,7 @@
         <w:rPr>
           <w:noProof/>
         </w:rPr>
-        <w:instrText xml:space="preserve"> PAGEREF _Toc241225206 \h </w:instrText>
+        <w:instrText xml:space="preserve"> PAGEREF _Toc241227266 \h </w:instrText>
       </w:r>
       <w:r>
         <w:rPr>
@@ -1434,7 +1434,7 @@
         <w:rPr>
           <w:noProof/>
         </w:rPr>
-        <w:instrText xml:space="preserve"> PAGEREF _Toc241225207 \h </w:instrText>
+        <w:instrText xml:space="preserve"> PAGEREF _Toc241227267 \h </w:instrText>
       </w:r>
       <w:r>
         <w:rPr>
@@ -1495,7 +1495,7 @@
         <w:rPr>
           <w:noProof/>
         </w:rPr>
-        <w:instrText xml:space="preserve"> PAGEREF _Toc241225208 \h </w:instrText>
+        <w:instrText xml:space="preserve"> PAGEREF _Toc241227268 \h </w:instrText>
       </w:r>
       <w:r>
         <w:rPr>
@@ -1556,7 +1556,7 @@
         <w:rPr>
           <w:noProof/>
         </w:rPr>
-        <w:instrText xml:space="preserve"> PAGEREF _Toc241225209 \h </w:instrText>
+        <w:instrText xml:space="preserve"> PAGEREF _Toc241227269 \h </w:instrText>
       </w:r>
       <w:r>
         <w:rPr>
@@ -1617,7 +1617,7 @@
         <w:rPr>
           <w:noProof/>
         </w:rPr>
-        <w:instrText xml:space="preserve"> PAGEREF _Toc241225210 \h </w:instrText>
+        <w:instrText xml:space="preserve"> PAGEREF _Toc241227270 \h </w:instrText>
       </w:r>
       <w:r>
         <w:rPr>
@@ -1678,7 +1678,7 @@
         <w:rPr>
           <w:noProof/>
         </w:rPr>
-        <w:instrText xml:space="preserve"> PAGEREF _Toc241225211 \h </w:instrText>
+        <w:instrText xml:space="preserve"> PAGEREF _Toc241227271 \h </w:instrText>
       </w:r>
       <w:r>
         <w:rPr>
@@ -1739,7 +1739,7 @@
         <w:rPr>
           <w:noProof/>
         </w:rPr>
-        <w:instrText xml:space="preserve"> PAGEREF _Toc241225212 \h </w:instrText>
+        <w:instrText xml:space="preserve"> PAGEREF _Toc241227272 \h </w:instrText>
       </w:r>
       <w:r>
         <w:rPr>
@@ -1800,7 +1800,7 @@
         <w:rPr>
           <w:noProof/>
         </w:rPr>
-        <w:instrText xml:space="preserve"> PAGEREF _Toc241225213 \h </w:instrText>
+        <w:instrText xml:space="preserve"> PAGEREF _Toc241227273 \h </w:instrText>
       </w:r>
       <w:r>
         <w:rPr>
@@ -1861,7 +1861,7 @@
         <w:rPr>
           <w:noProof/>
         </w:rPr>
-        <w:instrText xml:space="preserve"> PAGEREF _Toc241225214 \h </w:instrText>
+        <w:instrText xml:space="preserve"> PAGEREF _Toc241227274 \h </w:instrText>
       </w:r>
       <w:r>
         <w:rPr>
@@ -1922,7 +1922,7 @@
         <w:rPr>
           <w:noProof/>
         </w:rPr>
-        <w:instrText xml:space="preserve"> PAGEREF _Toc241225215 \h </w:instrText>
+        <w:instrText xml:space="preserve"> PAGEREF _Toc241227275 \h </w:instrText>
       </w:r>
       <w:r>
         <w:rPr>
@@ -1983,7 +1983,7 @@
         <w:rPr>
           <w:noProof/>
         </w:rPr>
-        <w:instrText xml:space="preserve"> PAGEREF _Toc241225216 \h </w:instrText>
+        <w:instrText xml:space="preserve"> PAGEREF _Toc241227276 \h </w:instrText>
       </w:r>
       <w:r>
         <w:rPr>
@@ -2045,7 +2045,7 @@
         <w:rPr>
           <w:noProof/>
         </w:rPr>
-        <w:instrText xml:space="preserve"> PAGEREF _Toc241225217 \h </w:instrText>
+        <w:instrText xml:space="preserve"> PAGEREF _Toc241227277 \h </w:instrText>
       </w:r>
       <w:r>
         <w:rPr>
@@ -2106,7 +2106,7 @@
         <w:rPr>
           <w:noProof/>
         </w:rPr>
-        <w:instrText xml:space="preserve"> PAGEREF _Toc241225218 \h </w:instrText>
+        <w:instrText xml:space="preserve"> PAGEREF _Toc241227278 \h </w:instrText>
       </w:r>
       <w:r>
         <w:rPr>
@@ -2167,7 +2167,7 @@
         <w:rPr>
           <w:noProof/>
         </w:rPr>
-        <w:instrText xml:space="preserve"> PAGEREF _Toc241225219 \h </w:instrText>
+        <w:instrText xml:space="preserve"> PAGEREF _Toc241227279 \h </w:instrText>
       </w:r>
       <w:r>
         <w:rPr>
@@ -2228,7 +2228,7 @@
         <w:rPr>
           <w:noProof/>
         </w:rPr>
-        <w:instrText xml:space="preserve"> PAGEREF _Toc241225220 \h </w:instrText>
+        <w:instrText xml:space="preserve"> PAGEREF _Toc241227280 \h </w:instrText>
       </w:r>
       <w:r>
         <w:rPr>
@@ -2289,7 +2289,7 @@
         <w:rPr>
           <w:noProof/>
         </w:rPr>
-        <w:instrText xml:space="preserve"> PAGEREF _Toc241225221 \h </w:instrText>
+        <w:instrText xml:space="preserve"> PAGEREF _Toc241227281 \h </w:instrText>
       </w:r>
       <w:r>
         <w:rPr>
@@ -2350,7 +2350,7 @@
         <w:rPr>
           <w:noProof/>
         </w:rPr>
-        <w:instrText xml:space="preserve"> PAGEREF _Toc241225222 \h </w:instrText>
+        <w:instrText xml:space="preserve"> PAGEREF _Toc241227282 \h </w:instrText>
       </w:r>
       <w:r>
         <w:rPr>
@@ -2411,7 +2411,7 @@
         <w:rPr>
           <w:noProof/>
         </w:rPr>
-        <w:instrText xml:space="preserve"> PAGEREF _Toc241225223 \h </w:instrText>
+        <w:instrText xml:space="preserve"> PAGEREF _Toc241227283 \h </w:instrText>
       </w:r>
       <w:r>
         <w:rPr>
@@ -2472,7 +2472,7 @@
         <w:rPr>
           <w:noProof/>
         </w:rPr>
-        <w:instrText xml:space="preserve"> PAGEREF _Toc241225224 \h </w:instrText>
+        <w:instrText xml:space="preserve"> PAGEREF _Toc241227284 \h </w:instrText>
       </w:r>
       <w:r>
         <w:rPr>
@@ -2533,7 +2533,7 @@
         <w:rPr>
           <w:noProof/>
         </w:rPr>
-        <w:instrText xml:space="preserve"> PAGEREF _Toc241225225 \h </w:instrText>
+        <w:instrText xml:space="preserve"> PAGEREF _Toc241227285 \h </w:instrText>
       </w:r>
       <w:r>
         <w:rPr>
@@ -2594,7 +2594,7 @@
         <w:rPr>
           <w:noProof/>
         </w:rPr>
-        <w:instrText xml:space="preserve"> PAGEREF _Toc241225226 \h </w:instrText>
+        <w:instrText xml:space="preserve"> PAGEREF _Toc241227286 \h </w:instrText>
       </w:r>
       <w:r>
         <w:rPr>
@@ -2655,7 +2655,7 @@
         <w:rPr>
           <w:noProof/>
         </w:rPr>
-        <w:instrText xml:space="preserve"> PAGEREF _Toc241225227 \h </w:instrText>
+        <w:instrText xml:space="preserve"> PAGEREF _Toc241227287 \h </w:instrText>
       </w:r>
       <w:r>
         <w:rPr>
@@ -2716,7 +2716,7 @@
         <w:rPr>
           <w:noProof/>
         </w:rPr>
-        <w:instrText xml:space="preserve"> PAGEREF _Toc241225228 \h </w:instrText>
+        <w:instrText xml:space="preserve"> PAGEREF _Toc241227288 \h </w:instrText>
       </w:r>
       <w:r>
         <w:rPr>
@@ -2777,7 +2777,7 @@
         <w:rPr>
           <w:noProof/>
         </w:rPr>
-        <w:instrText xml:space="preserve"> PAGEREF _Toc241225229 \h </w:instrText>
+        <w:instrText xml:space="preserve"> PAGEREF _Toc241227289 \h </w:instrText>
       </w:r>
       <w:r>
         <w:rPr>
@@ -2838,7 +2838,7 @@
         <w:rPr>
           <w:noProof/>
         </w:rPr>
-        <w:instrText xml:space="preserve"> PAGEREF _Toc241225230 \h </w:instrText>
+        <w:instrText xml:space="preserve"> PAGEREF _Toc241227290 \h </w:instrText>
       </w:r>
       <w:r>
         <w:rPr>
@@ -2899,7 +2899,7 @@
         <w:rPr>
           <w:noProof/>
         </w:rPr>
-        <w:instrText xml:space="preserve"> PAGEREF _Toc241225231 \h </w:instrText>
+        <w:instrText xml:space="preserve"> PAGEREF _Toc241227291 \h </w:instrText>
       </w:r>
       <w:r>
         <w:rPr>
@@ -2960,7 +2960,7 @@
         <w:rPr>
           <w:noProof/>
         </w:rPr>
-        <w:instrText xml:space="preserve"> PAGEREF _Toc241225232 \h </w:instrText>
+        <w:instrText xml:space="preserve"> PAGEREF _Toc241227292 \h </w:instrText>
       </w:r>
       <w:r>
         <w:rPr>
@@ -3021,7 +3021,7 @@
         <w:rPr>
           <w:noProof/>
         </w:rPr>
-        <w:instrText xml:space="preserve"> PAGEREF _Toc241225233 \h </w:instrText>
+        <w:instrText xml:space="preserve"> PAGEREF _Toc241227293 \h </w:instrText>
       </w:r>
       <w:r>
         <w:rPr>
@@ -3082,7 +3082,7 @@
         <w:rPr>
           <w:noProof/>
         </w:rPr>
-        <w:instrText xml:space="preserve"> PAGEREF _Toc241225234 \h </w:instrText>
+        <w:instrText xml:space="preserve"> PAGEREF _Toc241227294 \h </w:instrText>
       </w:r>
       <w:r>
         <w:rPr>
@@ -3143,7 +3143,7 @@
         <w:rPr>
           <w:noProof/>
         </w:rPr>
-        <w:instrText xml:space="preserve"> PAGEREF _Toc241225235 \h </w:instrText>
+        <w:instrText xml:space="preserve"> PAGEREF _Toc241227295 \h </w:instrText>
       </w:r>
       <w:r>
         <w:rPr>
@@ -3204,7 +3204,7 @@
         <w:rPr>
           <w:noProof/>
         </w:rPr>
-        <w:instrText xml:space="preserve"> PAGEREF _Toc241225236 \h </w:instrText>
+        <w:instrText xml:space="preserve"> PAGEREF _Toc241227296 \h </w:instrText>
       </w:r>
       <w:r>
         <w:rPr>
@@ -3265,7 +3265,7 @@
         <w:rPr>
           <w:noProof/>
         </w:rPr>
-        <w:instrText xml:space="preserve"> PAGEREF _Toc241225237 \h </w:instrText>
+        <w:instrText xml:space="preserve"> PAGEREF _Toc241227297 \h </w:instrText>
       </w:r>
       <w:r>
         <w:rPr>
@@ -3326,7 +3326,7 @@
         <w:rPr>
           <w:noProof/>
         </w:rPr>
-        <w:instrText xml:space="preserve"> PAGEREF _Toc241225238 \h </w:instrText>
+        <w:instrText xml:space="preserve"> PAGEREF _Toc241227298 \h </w:instrText>
       </w:r>
       <w:r>
         <w:rPr>
@@ -3387,7 +3387,7 @@
         <w:rPr>
           <w:noProof/>
         </w:rPr>
-        <w:instrText xml:space="preserve"> PAGEREF _Toc241225239 \h </w:instrText>
+        <w:instrText xml:space="preserve"> PAGEREF _Toc241227299 \h </w:instrText>
       </w:r>
       <w:r>
         <w:rPr>
@@ -3448,7 +3448,7 @@
         <w:rPr>
           <w:noProof/>
         </w:rPr>
-        <w:instrText xml:space="preserve"> PAGEREF _Toc241225240 \h </w:instrText>
+        <w:instrText xml:space="preserve"> PAGEREF _Toc241227300 \h </w:instrText>
       </w:r>
       <w:r>
         <w:rPr>
@@ -3509,7 +3509,7 @@
         <w:rPr>
           <w:noProof/>
         </w:rPr>
-        <w:instrText xml:space="preserve"> PAGEREF _Toc241225241 \h </w:instrText>
+        <w:instrText xml:space="preserve"> PAGEREF _Toc241227301 \h </w:instrText>
       </w:r>
       <w:r>
         <w:rPr>
@@ -3570,7 +3570,7 @@
         <w:rPr>
           <w:noProof/>
         </w:rPr>
-        <w:instrText xml:space="preserve"> PAGEREF _Toc241225242 \h </w:instrText>
+        <w:instrText xml:space="preserve"> PAGEREF _Toc241227302 \h </w:instrText>
       </w:r>
       <w:r>
         <w:rPr>
@@ -3631,7 +3631,7 @@
         <w:rPr>
           <w:noProof/>
         </w:rPr>
-        <w:instrText xml:space="preserve"> PAGEREF _Toc241225243 \h </w:instrText>
+        <w:instrText xml:space="preserve"> PAGEREF _Toc241227303 \h </w:instrText>
       </w:r>
       <w:r>
         <w:rPr>
@@ -3693,7 +3693,7 @@
         <w:rPr>
           <w:noProof/>
         </w:rPr>
-        <w:instrText xml:space="preserve"> PAGEREF _Toc241225244 \h </w:instrText>
+        <w:instrText xml:space="preserve"> PAGEREF _Toc241227304 \h </w:instrText>
       </w:r>
       <w:r>
         <w:rPr>
@@ -3754,7 +3754,7 @@
         <w:rPr>
           <w:noProof/>
         </w:rPr>
-        <w:instrText xml:space="preserve"> PAGEREF _Toc241225245 \h </w:instrText>
+        <w:instrText xml:space="preserve"> PAGEREF _Toc241227305 \h </w:instrText>
       </w:r>
       <w:r>
         <w:rPr>
@@ -3815,7 +3815,7 @@
         <w:rPr>
           <w:noProof/>
         </w:rPr>
-        <w:instrText xml:space="preserve"> PAGEREF _Toc241225246 \h </w:instrText>
+        <w:instrText xml:space="preserve"> PAGEREF _Toc241227306 \h </w:instrText>
       </w:r>
       <w:r>
         <w:rPr>
@@ -3876,7 +3876,7 @@
         <w:rPr>
           <w:noProof/>
         </w:rPr>
-        <w:instrText xml:space="preserve"> PAGEREF _Toc241225247 \h </w:instrText>
+        <w:instrText xml:space="preserve"> PAGEREF _Toc241227307 \h </w:instrText>
       </w:r>
       <w:r>
         <w:rPr>
@@ -3937,7 +3937,7 @@
         <w:rPr>
           <w:noProof/>
         </w:rPr>
-        <w:instrText xml:space="preserve"> PAGEREF _Toc241225248 \h </w:instrText>
+        <w:instrText xml:space="preserve"> PAGEREF _Toc241227308 \h </w:instrText>
       </w:r>
       <w:r>
         <w:rPr>
@@ -3998,7 +3998,7 @@
         <w:rPr>
           <w:noProof/>
         </w:rPr>
-        <w:instrText xml:space="preserve"> PAGEREF _Toc241225249 \h </w:instrText>
+        <w:instrText xml:space="preserve"> PAGEREF _Toc241227309 \h </w:instrText>
       </w:r>
       <w:r>
         <w:rPr>
@@ -4059,7 +4059,7 @@
         <w:rPr>
           <w:noProof/>
         </w:rPr>
-        <w:instrText xml:space="preserve"> PAGEREF _Toc241225250 \h </w:instrText>
+        <w:instrText xml:space="preserve"> PAGEREF _Toc241227310 \h </w:instrText>
       </w:r>
       <w:r>
         <w:rPr>
@@ -4120,7 +4120,7 @@
         <w:rPr>
           <w:noProof/>
         </w:rPr>
-        <w:instrText xml:space="preserve"> PAGEREF _Toc241225251 \h </w:instrText>
+        <w:instrText xml:space="preserve"> PAGEREF _Toc241227311 \h </w:instrText>
       </w:r>
       <w:r>
         <w:rPr>
@@ -4181,7 +4181,7 @@
         <w:rPr>
           <w:noProof/>
         </w:rPr>
-        <w:instrText xml:space="preserve"> PAGEREF _Toc241225252 \h </w:instrText>
+        <w:instrText xml:space="preserve"> PAGEREF _Toc241227312 \h </w:instrText>
       </w:r>
       <w:r>
         <w:rPr>
@@ -4242,7 +4242,7 @@
         <w:rPr>
           <w:noProof/>
         </w:rPr>
-        <w:instrText xml:space="preserve"> PAGEREF _Toc241225253 \h </w:instrText>
+        <w:instrText xml:space="preserve"> PAGEREF _Toc241227313 \h </w:instrText>
       </w:r>
       <w:r>
         <w:rPr>
@@ -4303,7 +4303,7 @@
         <w:rPr>
           <w:noProof/>
         </w:rPr>
-        <w:instrText xml:space="preserve"> PAGEREF _Toc241225254 \h </w:instrText>
+        <w:instrText xml:space="preserve"> PAGEREF _Toc241227314 \h </w:instrText>
       </w:r>
       <w:r>
         <w:rPr>
@@ -4364,7 +4364,7 @@
         <w:rPr>
           <w:noProof/>
         </w:rPr>
-        <w:instrText xml:space="preserve"> PAGEREF _Toc241225255 \h </w:instrText>
+        <w:instrText xml:space="preserve"> PAGEREF _Toc241227315 \h </w:instrText>
       </w:r>
       <w:r>
         <w:rPr>
@@ -4425,7 +4425,7 @@
         <w:rPr>
           <w:noProof/>
         </w:rPr>
-        <w:instrText xml:space="preserve"> PAGEREF _Toc241225256 \h </w:instrText>
+        <w:instrText xml:space="preserve"> PAGEREF _Toc241227316 \h </w:instrText>
       </w:r>
       <w:r>
         <w:rPr>
@@ -4486,7 +4486,7 @@
         <w:rPr>
           <w:noProof/>
         </w:rPr>
-        <w:instrText xml:space="preserve"> PAGEREF _Toc241225257 \h </w:instrText>
+        <w:instrText xml:space="preserve"> PAGEREF _Toc241227317 \h </w:instrText>
       </w:r>
       <w:r>
         <w:rPr>
@@ -4547,7 +4547,7 @@
         <w:rPr>
           <w:noProof/>
         </w:rPr>
-        <w:instrText xml:space="preserve"> PAGEREF _Toc241225258 \h </w:instrText>
+        <w:instrText xml:space="preserve"> PAGEREF _Toc241227318 \h </w:instrText>
       </w:r>
       <w:r>
         <w:rPr>
@@ -4608,7 +4608,7 @@
         <w:rPr>
           <w:noProof/>
         </w:rPr>
-        <w:instrText xml:space="preserve"> PAGEREF _Toc241225259 \h </w:instrText>
+        <w:instrText xml:space="preserve"> PAGEREF _Toc241227319 \h </w:instrText>
       </w:r>
       <w:r>
         <w:rPr>
@@ -4669,7 +4669,7 @@
         <w:rPr>
           <w:noProof/>
         </w:rPr>
-        <w:instrText xml:space="preserve"> PAGEREF _Toc241225260 \h </w:instrText>
+        <w:instrText xml:space="preserve"> PAGEREF _Toc241227320 \h </w:instrText>
       </w:r>
       <w:r>
         <w:rPr>
@@ -4730,7 +4730,7 @@
         <w:rPr>
           <w:noProof/>
         </w:rPr>
-        <w:instrText xml:space="preserve"> PAGEREF _Toc241225261 \h </w:instrText>
+        <w:instrText xml:space="preserve"> PAGEREF _Toc241227321 \h </w:instrText>
       </w:r>
       <w:r>
         <w:rPr>
@@ -4791,7 +4791,7 @@
         <w:rPr>
           <w:noProof/>
         </w:rPr>
-        <w:instrText xml:space="preserve"> PAGEREF _Toc241225262 \h </w:instrText>
+        <w:instrText xml:space="preserve"> PAGEREF _Toc241227322 \h </w:instrText>
       </w:r>
       <w:r>
         <w:rPr>
@@ -4852,7 +4852,7 @@
         <w:rPr>
           <w:noProof/>
         </w:rPr>
-        <w:instrText xml:space="preserve"> PAGEREF _Toc241225263 \h </w:instrText>
+        <w:instrText xml:space="preserve"> PAGEREF _Toc241227323 \h </w:instrText>
       </w:r>
       <w:r>
         <w:rPr>
@@ -4913,7 +4913,7 @@
         <w:rPr>
           <w:noProof/>
         </w:rPr>
-        <w:instrText xml:space="preserve"> PAGEREF _Toc241225264 \h </w:instrText>
+        <w:instrText xml:space="preserve"> PAGEREF _Toc241227324 \h </w:instrText>
       </w:r>
       <w:r>
         <w:rPr>
@@ -4997,7 +4997,7 @@
       <w:pPr>
         <w:pStyle w:val="Ttulo1"/>
       </w:pPr>
-      <w:bookmarkStart w:id="0" w:name="_Toc241225191"/>
+      <w:bookmarkStart w:id="0" w:name="_Toc241227251"/>
       <w:r>
         <w:lastRenderedPageBreak/>
         <w:t>1 INTRODUÇÃO</w:t>
@@ -5069,7 +5069,7 @@
       <w:pPr>
         <w:pStyle w:val="Ttulo1"/>
       </w:pPr>
-      <w:bookmarkStart w:id="1" w:name="_Toc241225192"/>
+      <w:bookmarkStart w:id="1" w:name="_Toc241227252"/>
       <w:r>
         <w:lastRenderedPageBreak/>
         <w:t>2 CARACTERIZAÇÃO DA ORGANIZAÇÃO</w:t>
@@ -5080,7 +5080,7 @@
       <w:pPr>
         <w:pStyle w:val="Ttulo2"/>
       </w:pPr>
-      <w:bookmarkStart w:id="2" w:name="_Toc241225193"/>
+      <w:bookmarkStart w:id="2" w:name="_Toc241227253"/>
       <w:r>
         <w:t>2.1 Segmento de atuação</w:t>
       </w:r>
@@ -5106,7 +5106,7 @@
       <w:pPr>
         <w:pStyle w:val="Ttulo2"/>
       </w:pPr>
-      <w:bookmarkStart w:id="3" w:name="_Toc241225194"/>
+      <w:bookmarkStart w:id="3" w:name="_Toc241227254"/>
       <w:r>
         <w:t>2.2 Produtos e serviços</w:t>
       </w:r>
@@ -5124,7 +5124,7 @@
       <w:pPr>
         <w:pStyle w:val="Ttulo2"/>
       </w:pPr>
-      <w:bookmarkStart w:id="4" w:name="_Toc241225195"/>
+      <w:bookmarkStart w:id="4" w:name="_Toc241227255"/>
       <w:r>
         <w:t>2.3 Estrutura organizacional</w:t>
       </w:r>
@@ -5177,7 +5177,7 @@
       <w:pPr>
         <w:pStyle w:val="Ttulo2"/>
       </w:pPr>
-      <w:bookmarkStart w:id="5" w:name="_Toc241225196"/>
+      <w:bookmarkStart w:id="5" w:name="_Toc241227256"/>
       <w:r>
         <w:t>2.4 Principais processos</w:t>
       </w:r>
@@ -5235,7 +5235,7 @@
       <w:pPr>
         <w:pStyle w:val="Ttulo2"/>
       </w:pPr>
-      <w:bookmarkStart w:id="6" w:name="_Toc241225197"/>
+      <w:bookmarkStart w:id="6" w:name="_Toc241227257"/>
       <w:r>
         <w:t>2.5 Problemas identificados</w:t>
       </w:r>
@@ -5307,7 +5307,7 @@
       <w:pPr>
         <w:pStyle w:val="Ttulo2"/>
       </w:pPr>
-      <w:bookmarkStart w:id="7" w:name="_Toc241225198"/>
+      <w:bookmarkStart w:id="7" w:name="_Toc241227258"/>
       <w:r>
         <w:t>2.6 Oportunidades de melhoria por meio da tecnologia</w:t>
       </w:r>
@@ -5877,7 +5877,7 @@
       <w:pPr>
         <w:pStyle w:val="Ttulo1"/>
       </w:pPr>
-      <w:bookmarkStart w:id="8" w:name="_Toc241225199"/>
+      <w:bookmarkStart w:id="8" w:name="_Toc241227259"/>
       <w:r>
         <w:lastRenderedPageBreak/>
         <w:t>3 PLANEJAMENTO DA SOLUÇÃO TECNOLÓGICA</w:t>
@@ -5899,7 +5899,7 @@
       <w:pPr>
         <w:pStyle w:val="Ttulo2"/>
       </w:pPr>
-      <w:bookmarkStart w:id="9" w:name="_Toc241225200"/>
+      <w:bookmarkStart w:id="9" w:name="_Toc241227260"/>
       <w:r>
         <w:t>3.1 Problema a ser resolvido</w:t>
       </w:r>
@@ -5926,7 +5926,7 @@
       <w:pPr>
         <w:pStyle w:val="Ttulo2"/>
       </w:pPr>
-      <w:bookmarkStart w:id="10" w:name="_Toc241225201"/>
+      <w:bookmarkStart w:id="10" w:name="_Toc241227261"/>
       <w:r>
         <w:t>3.2 Objetivos da solução</w:t>
       </w:r>
@@ -5964,7 +5964,7 @@
       <w:pPr>
         <w:pStyle w:val="Ttulo2"/>
       </w:pPr>
-      <w:bookmarkStart w:id="11" w:name="_Toc241225202"/>
+      <w:bookmarkStart w:id="11" w:name="_Toc241227262"/>
       <w:r>
         <w:t>3.3 Público-alvo</w:t>
       </w:r>
@@ -6009,7 +6009,7 @@
       <w:pPr>
         <w:pStyle w:val="Ttulo2"/>
       </w:pPr>
-      <w:bookmarkStart w:id="12" w:name="_Toc241225203"/>
+      <w:bookmarkStart w:id="12" w:name="_Toc241227263"/>
       <w:r>
         <w:t>3.4 Proposta de valor</w:t>
       </w:r>
@@ -6063,7 +6063,7 @@
       <w:pPr>
         <w:pStyle w:val="Ttulo2"/>
       </w:pPr>
-      <w:bookmarkStart w:id="13" w:name="_Toc241225204"/>
+      <w:bookmarkStart w:id="13" w:name="_Toc241227264"/>
       <w:r>
         <w:lastRenderedPageBreak/>
         <w:t>3.5 Benefícios esperados</w:t>
@@ -6617,7 +6617,7 @@
       <w:pPr>
         <w:pStyle w:val="Ttulo2"/>
       </w:pPr>
-      <w:bookmarkStart w:id="14" w:name="_Toc241225205"/>
+      <w:bookmarkStart w:id="14" w:name="_Toc241227265"/>
       <w:r>
         <w:t>3.6 Diferenciais competitivos</w:t>
       </w:r>
@@ -6680,7 +6680,7 @@
       <w:pPr>
         <w:pStyle w:val="Ttulo2"/>
       </w:pPr>
-      <w:bookmarkStart w:id="15" w:name="_Toc241225206"/>
+      <w:bookmarkStart w:id="15" w:name="_Toc241227266"/>
       <w:r>
         <w:t>3.7 Modelo de negócio e viabilidade</w:t>
       </w:r>
@@ -7147,7 +7147,7 @@
       <w:pPr>
         <w:pStyle w:val="Ttulo1"/>
       </w:pPr>
-      <w:bookmarkStart w:id="16" w:name="_Toc241225207"/>
+      <w:bookmarkStart w:id="16" w:name="_Toc241227267"/>
       <w:r>
         <w:lastRenderedPageBreak/>
         <w:t>4 RESPONSABILIDADE SOCIAL E DIVERSIDADE</w:t>
@@ -7169,7 +7169,7 @@
       <w:pPr>
         <w:pStyle w:val="Ttulo2"/>
       </w:pPr>
-      <w:bookmarkStart w:id="17" w:name="_Toc241225208"/>
+      <w:bookmarkStart w:id="17" w:name="_Toc241227268"/>
       <w:r>
         <w:t>4.1 Combate à discriminação</w:t>
       </w:r>
@@ -7223,7 +7223,7 @@
       <w:pPr>
         <w:pStyle w:val="Ttulo2"/>
       </w:pPr>
-      <w:bookmarkStart w:id="18" w:name="_Toc241225209"/>
+      <w:bookmarkStart w:id="18" w:name="_Toc241227269"/>
       <w:r>
         <w:t>4.2 Valorização da diversidade</w:t>
       </w:r>
@@ -7268,7 +7268,7 @@
       <w:pPr>
         <w:pStyle w:val="Ttulo2"/>
       </w:pPr>
-      <w:bookmarkStart w:id="19" w:name="_Toc241225210"/>
+      <w:bookmarkStart w:id="19" w:name="_Toc241227270"/>
       <w:r>
         <w:t>4.3 Recursos tecnológicos inclusivos</w:t>
       </w:r>
@@ -7331,7 +7331,7 @@
       <w:pPr>
         <w:pStyle w:val="Ttulo2"/>
       </w:pPr>
-      <w:bookmarkStart w:id="20" w:name="_Toc241225211"/>
+      <w:bookmarkStart w:id="20" w:name="_Toc241227271"/>
       <w:r>
         <w:lastRenderedPageBreak/>
         <w:t>4.4 Ações voltadas à acessibilidade</w:t>
@@ -7635,7 +7635,7 @@
       <w:pPr>
         <w:pStyle w:val="Ttulo2"/>
       </w:pPr>
-      <w:bookmarkStart w:id="21" w:name="_Toc241225212"/>
+      <w:bookmarkStart w:id="21" w:name="_Toc241227272"/>
       <w:r>
         <w:t>4.5 Tecnologia para a promoção da cidadania</w:t>
       </w:r>
@@ -7680,7 +7680,7 @@
       <w:pPr>
         <w:pStyle w:val="Ttulo2"/>
       </w:pPr>
-      <w:bookmarkStart w:id="22" w:name="_Toc241225213"/>
+      <w:bookmarkStart w:id="22" w:name="_Toc241227273"/>
       <w:r>
         <w:t>4.6 Farol de Evasão</w:t>
       </w:r>
@@ -8280,7 +8280,7 @@
           <w:noProof/>
         </w:rPr>
         <w:drawing>
-          <wp:inline distT="0" distB="0" distL="0" distR="0" wp14:anchorId="4F5BBEB8" wp14:editId="2259275D">
+          <wp:inline distT="0" distB="0" distL="0" distR="0" wp14:anchorId="728BA24A" wp14:editId="2DE45415">
             <wp:extent cx="5400000" cy="2256548"/>
             <wp:effectExtent l="0" t="0" r="0" b="0"/>
             <wp:docPr id="2" name="Imagem 2"/>
@@ -8343,7 +8343,7 @@
       <w:pPr>
         <w:pStyle w:val="Ttulo1"/>
       </w:pPr>
-      <w:bookmarkStart w:id="23" w:name="_Toc241225214"/>
+      <w:bookmarkStart w:id="23" w:name="_Toc241227274"/>
       <w:r>
         <w:lastRenderedPageBreak/>
         <w:t>5 DESENVOLVIMENTO DA SOLUÇÃO WEB</w:t>
@@ -8365,7 +8365,7 @@
       <w:pPr>
         <w:pStyle w:val="Ttulo2"/>
       </w:pPr>
-      <w:bookmarkStart w:id="24" w:name="_Toc241225215"/>
+      <w:bookmarkStart w:id="24" w:name="_Toc241227275"/>
       <w:r>
         <w:t>5.1 Arquitetura da aplicação</w:t>
       </w:r>
@@ -8430,7 +8430,7 @@
           <w:noProof/>
         </w:rPr>
         <w:drawing>
-          <wp:inline distT="0" distB="0" distL="0" distR="0" wp14:anchorId="6065DF4F" wp14:editId="57609427">
+          <wp:inline distT="0" distB="0" distL="0" distR="0" wp14:anchorId="0BEBC48E" wp14:editId="3E2008E5">
             <wp:extent cx="5400000" cy="2633929"/>
             <wp:effectExtent l="0" t="0" r="0" b="0"/>
             <wp:docPr id="3" name="Imagem 3"/>
@@ -8484,7 +8484,7 @@
       <w:pPr>
         <w:pStyle w:val="Ttulo2"/>
       </w:pPr>
-      <w:bookmarkStart w:id="25" w:name="_Toc241225216"/>
+      <w:bookmarkStart w:id="25" w:name="_Toc241227276"/>
       <w:r>
         <w:lastRenderedPageBreak/>
         <w:t>5.2 Interface de programação REST</w:t>
@@ -9409,7 +9409,7 @@
       <w:pPr>
         <w:pStyle w:val="Ttulo2"/>
       </w:pPr>
-      <w:bookmarkStart w:id="26" w:name="_Toc241225217"/>
+      <w:bookmarkStart w:id="26" w:name="_Toc241227277"/>
       <w:r>
         <w:t>5.3 Autenticação</w:t>
       </w:r>
@@ -9470,7 +9470,7 @@
       <w:pPr>
         <w:pStyle w:val="Ttulo2"/>
       </w:pPr>
-      <w:bookmarkStart w:id="27" w:name="_Toc241225218"/>
+      <w:bookmarkStart w:id="27" w:name="_Toc241227278"/>
       <w:r>
         <w:t>5.4 Segurança</w:t>
       </w:r>
@@ -9581,7 +9581,7 @@
       <w:pPr>
         <w:pStyle w:val="Ttulo2"/>
       </w:pPr>
-      <w:bookmarkStart w:id="28" w:name="_Toc241225219"/>
+      <w:bookmarkStart w:id="28" w:name="_Toc241227279"/>
       <w:r>
         <w:t>5.5 Estrutura administrativa</w:t>
       </w:r>
@@ -9623,7 +9623,7 @@
         </w:rPr>
         <w:lastRenderedPageBreak/>
         <w:drawing>
-          <wp:inline distT="0" distB="0" distL="0" distR="0" wp14:anchorId="7213E16A" wp14:editId="3B02B559">
+          <wp:inline distT="0" distB="0" distL="0" distR="0" wp14:anchorId="529297D3" wp14:editId="04C64F36">
             <wp:extent cx="5400000" cy="2680952"/>
             <wp:effectExtent l="0" t="0" r="0" b="5715"/>
             <wp:docPr id="4" name="Imagem 4"/>
@@ -9677,7 +9677,7 @@
       <w:pPr>
         <w:pStyle w:val="Ttulo2"/>
       </w:pPr>
-      <w:bookmarkStart w:id="29" w:name="_Toc241225220"/>
+      <w:bookmarkStart w:id="29" w:name="_Toc241227280"/>
       <w:r>
         <w:t>5.6 Assistente virtual</w:t>
       </w:r>
@@ -9782,7 +9782,7 @@
           <w:noProof/>
         </w:rPr>
         <w:drawing>
-          <wp:inline distT="0" distB="0" distL="0" distR="0" wp14:anchorId="6DCC743D" wp14:editId="5E61C3E8">
+          <wp:inline distT="0" distB="0" distL="0" distR="0" wp14:anchorId="764B48A7" wp14:editId="4DCA93E2">
             <wp:extent cx="5400000" cy="2645238"/>
             <wp:effectExtent l="0" t="0" r="0" b="3175"/>
             <wp:docPr id="5" name="Imagem 5"/>
@@ -9836,7 +9836,7 @@
       <w:pPr>
         <w:pStyle w:val="Ttulo2"/>
       </w:pPr>
-      <w:bookmarkStart w:id="30" w:name="_Toc241225221"/>
+      <w:bookmarkStart w:id="30" w:name="_Toc241227281"/>
       <w:r>
         <w:t>5.7 Integração entre módulos</w:t>
       </w:r>
@@ -9854,7 +9854,7 @@
       <w:pPr>
         <w:pStyle w:val="Ttulo2"/>
       </w:pPr>
-      <w:bookmarkStart w:id="31" w:name="_Toc241225222"/>
+      <w:bookmarkStart w:id="31" w:name="_Toc241227282"/>
       <w:r>
         <w:t>5.8 Correções decorrentes de teste em dispositivo real</w:t>
       </w:r>
@@ -9947,7 +9947,7 @@
       <w:pPr>
         <w:pStyle w:val="Ttulo1"/>
       </w:pPr>
-      <w:bookmarkStart w:id="32" w:name="_Toc241225223"/>
+      <w:bookmarkStart w:id="32" w:name="_Toc241227283"/>
       <w:r>
         <w:lastRenderedPageBreak/>
         <w:t>6 DESENVOLVIMENTO DA SOLUÇÃO MOBILE</w:t>
@@ -9969,7 +9969,7 @@
       <w:pPr>
         <w:pStyle w:val="Ttulo2"/>
       </w:pPr>
-      <w:bookmarkStart w:id="33" w:name="_Toc241225224"/>
+      <w:bookmarkStart w:id="33" w:name="_Toc241227284"/>
       <w:r>
         <w:t>6.1 Tecnologia adotada e justificativa</w:t>
       </w:r>
@@ -10022,7 +10022,7 @@
       <w:pPr>
         <w:pStyle w:val="Ttulo2"/>
       </w:pPr>
-      <w:bookmarkStart w:id="34" w:name="_Toc241225225"/>
+      <w:bookmarkStart w:id="34" w:name="_Toc241227285"/>
       <w:r>
         <w:t>6.2 Telas principais</w:t>
       </w:r>
@@ -10144,7 +10144,7 @@
               </w:rPr>
               <w:lastRenderedPageBreak/>
               <w:drawing>
-                <wp:inline distT="0" distB="0" distL="0" distR="0" wp14:anchorId="78728923" wp14:editId="1B02437C">
+                <wp:inline distT="0" distB="0" distL="0" distR="0" wp14:anchorId="2BFFB2F9" wp14:editId="5A81E452">
                   <wp:extent cx="1831474" cy="3960000"/>
                   <wp:effectExtent l="0" t="0" r="0" b="2540"/>
                   <wp:docPr id="7" name="Imagem 7"/>
@@ -10190,7 +10190,7 @@
                 <w:noProof/>
               </w:rPr>
               <w:drawing>
-                <wp:inline distT="0" distB="0" distL="0" distR="0" wp14:anchorId="6004E332" wp14:editId="3C60634B">
+                <wp:inline distT="0" distB="0" distL="0" distR="0" wp14:anchorId="6FF3324D" wp14:editId="412FFB89">
                   <wp:extent cx="1828973" cy="3960001"/>
                   <wp:effectExtent l="0" t="0" r="0" b="2540"/>
                   <wp:docPr id="6" name="Imagem 6"/>
@@ -10269,7 +10269,7 @@
               </w:rPr>
               <w:lastRenderedPageBreak/>
               <w:drawing>
-                <wp:inline distT="0" distB="0" distL="0" distR="0" wp14:anchorId="128CA297" wp14:editId="501D7A7F">
+                <wp:inline distT="0" distB="0" distL="0" distR="0" wp14:anchorId="30219339" wp14:editId="3B2A2326">
                   <wp:extent cx="1831474" cy="3960000"/>
                   <wp:effectExtent l="0" t="0" r="0" b="2540"/>
                   <wp:docPr id="9" name="Imagem 9"/>
@@ -10315,7 +10315,7 @@
                 <w:noProof/>
               </w:rPr>
               <w:drawing>
-                <wp:inline distT="0" distB="0" distL="0" distR="0" wp14:anchorId="294E5DF7" wp14:editId="7191F45E">
+                <wp:inline distT="0" distB="0" distL="0" distR="0" wp14:anchorId="35A4903F" wp14:editId="05966981">
                   <wp:extent cx="1831474" cy="3960000"/>
                   <wp:effectExtent l="0" t="0" r="0" b="2540"/>
                   <wp:docPr id="8" name="Imagem 8"/>
@@ -10389,7 +10389,7 @@
       <w:pPr>
         <w:pStyle w:val="Ttulo2"/>
       </w:pPr>
-      <w:bookmarkStart w:id="35" w:name="_Toc241225226"/>
+      <w:bookmarkStart w:id="35" w:name="_Toc241227286"/>
       <w:r>
         <w:lastRenderedPageBreak/>
         <w:t>6.3 Fluxo de navegação</w:t>
@@ -10434,7 +10434,7 @@
       <w:pPr>
         <w:pStyle w:val="Ttulo2"/>
       </w:pPr>
-      <w:bookmarkStart w:id="36" w:name="_Toc241225227"/>
+      <w:bookmarkStart w:id="36" w:name="_Toc241227287"/>
       <w:r>
         <w:t>6.4 Autenticação e armazenamento seguro</w:t>
       </w:r>
@@ -10489,7 +10489,7 @@
       <w:pPr>
         <w:pStyle w:val="Ttulo2"/>
       </w:pPr>
-      <w:bookmarkStart w:id="37" w:name="_Toc241225228"/>
+      <w:bookmarkStart w:id="37" w:name="_Toc241227288"/>
       <w:r>
         <w:t>6.5 Sincronização de dados</w:t>
       </w:r>
@@ -10525,7 +10525,7 @@
       <w:pPr>
         <w:pStyle w:val="Ttulo2"/>
       </w:pPr>
-      <w:bookmarkStart w:id="38" w:name="_Toc241225229"/>
+      <w:bookmarkStart w:id="38" w:name="_Toc241227289"/>
       <w:r>
         <w:t>6.6 Integração com a interface de programação</w:t>
       </w:r>
@@ -10544,16 +10544,19 @@
         <w:ind w:firstLine="850"/>
       </w:pPr>
       <w:r>
-        <w:t>A camada de acesso concentra três responsabilidades: montagem das requisições com injeção automática do token; normalização do envelope de resposta; e aplicação de tempo limite de quinze segundos, evitando que a interface permaneça indefinidamente em espera diante de um servidor inacessível.</w:t>
+        <w:t xml:space="preserve">A camada de acesso concentra três responsabilidades: montagem das requisições com injeção automática do token; normalização do envelope de resposta; e aplicação de tempo limite, evitando espera indefinida. Com a implantação da seção 9, o aplicativo passou a consumir a instância em nuvem e funciona em qualquer rede, inclusive dados móveis. O tempo </w:t>
+      </w:r>
+      <w:r>
+        <w:lastRenderedPageBreak/>
+        <w:t>limite foi ampliado de quinze para sessenta segundos, pois o plano gratuito hiberna e leva cerca de 50 segundos para acordar; para reduzir a espera, o aplicativo dispara a verificação de saúde ao ser aberto, e o servidor acorda enquanto o usuário digita as credenciais.</w:t>
       </w:r>
     </w:p>
     <w:p>
       <w:pPr>
         <w:pStyle w:val="Ttulo2"/>
       </w:pPr>
-      <w:bookmarkStart w:id="39" w:name="_Toc241225230"/>
-      <w:r>
-        <w:lastRenderedPageBreak/>
+      <w:bookmarkStart w:id="39" w:name="_Toc241227290"/>
+      <w:r>
         <w:t>6.7 Acessibilidade no aplicativo</w:t>
       </w:r>
       <w:bookmarkEnd w:id="39"/>
@@ -10583,7 +10586,7 @@
           <w:noProof/>
         </w:rPr>
         <w:drawing>
-          <wp:inline distT="0" distB="0" distL="0" distR="0" wp14:anchorId="4C68FDA9" wp14:editId="5115B9A3">
+          <wp:inline distT="0" distB="0" distL="0" distR="0" wp14:anchorId="5A03CF5A" wp14:editId="08075922">
             <wp:extent cx="2497558" cy="5400000"/>
             <wp:effectExtent l="0" t="0" r="0" b="0"/>
             <wp:docPr id="10" name="Imagem 10"/>
@@ -10638,11 +10641,11 @@
         <w:ind w:firstLine="850"/>
       </w:pPr>
       <w:r>
-        <w:t xml:space="preserve">A captura desta figura revelou um defeito que três revisões do código não haviam identificado. A paleta de alto contraste substitui a cor de destaque pelo amarelo, mas o texto sobreposto a essas superfícies permanecia branco, produzindo razão de contraste de 1,07:1 quando a WCAG 2.1 exige 4,5:1 no nível AA. Cinco componentes eram afetados, entre eles o próprio interruptor de alto contraste: o texto que descreve o recurso tornava-se ilegível exatamente quando o recurso era acionado. A correção introduziu um token cromático </w:t>
+        <w:t xml:space="preserve">A captura desta figura revelou um defeito que três revisões do código não haviam identificado. A paleta de alto contraste substitui a cor de destaque pelo amarelo, mas o texto sobreposto a essas superfícies permanecia branco, produzindo razão de contraste de 1,07:1 </w:t>
       </w:r>
       <w:r>
         <w:lastRenderedPageBreak/>
-        <w:t>específico para texto sobre superfícies de destaque, definido por paleta; em alto contraste, o preto sobre amarelo rende 19,6:1.</w:t>
+        <w:t>quando a WCAG 2.1 exige 4,5:1 no nível AA. Cinco componentes eram afetados, entre eles o próprio interruptor de alto contraste: o texto que descreve o recurso tornava-se ilegível exatamente quando o recurso era acionado. A correção introduziu um token cromático específico para texto sobre superfícies de destaque, definido por paleta; em alto contraste, o preto sobre amarelo rende 19,6:1.</w:t>
       </w:r>
     </w:p>
     <w:p>
@@ -10657,7 +10660,7 @@
       <w:pPr>
         <w:pStyle w:val="Ttulo2"/>
       </w:pPr>
-      <w:bookmarkStart w:id="40" w:name="_Toc241225231"/>
+      <w:bookmarkStart w:id="40" w:name="_Toc241227291"/>
       <w:r>
         <w:t>6.8 Verificação</w:t>
       </w:r>
@@ -10694,7 +10697,7 @@
         <w:ind w:firstLine="850"/>
       </w:pPr>
       <w:r>
-        <w:t>O aparelho não alcançava o servidor porque o firewall bloqueava as portas em rede classificada como pública, resolvido por regra restrita à sub-rede local. O endereço deixou de responder após renovação por DHCP, corrigido pela atualização da configuração e pela recomendação de reserva fixa. O projeto foi recusado pelo aplicativo intermediário por divergência de SDK, resolvida pelo alinhamento à versão vigente, e novamente por falta de autenticação, já que o aplicativo estava vinculado a uma conta enquanto a ferramenta de linha de comando permanecia anônima.</w:t>
+        <w:t>O aparelho não alcançava o servidor porque o firewall bloqueava as portas em rede classificada como pública, resolvido por regra restrita à sub-rede local. O endereço deixou de responder após renovação por DHCP, corrigido pela atualização da configuração — dificuldades de rede local que a migração para a nuvem eliminou. O projeto foi recusado pelo aplicativo intermediário por divergência de SDK, resolvida pelo alinhamento à versão vigente, e novamente por falta de autenticação, já que o aplicativo estava vinculado a uma conta enquanto a ferramenta de linha de comando permanecia anônima.</w:t>
       </w:r>
     </w:p>
     <w:p>
@@ -10702,15 +10705,7 @@
         <w:ind w:firstLine="850"/>
       </w:pPr>
       <w:r>
-        <w:t>O segundo obstáculo ilustra a fragilidade de ambientes apoiados em endereçamento dinâmico: o endereço da estação foi alterado pelo roteador no intervalo entre dois testes, fazendo falhar uma configuração que antes funcionava.</w:t>
-      </w:r>
-    </w:p>
-    <w:p>
-      <w:pPr>
-        <w:ind w:firstLine="850"/>
-      </w:pPr>
-      <w:r>
-        <w:t>O terceiro ocorreu duas vezes, em sentidos opostos. O aplicativo intermediário usado para executar o projeto em dispositivo físico é distribuído pela loja da fabricante, que mantém apenas a versão mais recente. Quando o projeto foi criado, essa versão era anterior à dele, o que exigiu regredi-lo; semanas depois, o aplicativo atualizou-se automaticamente e passou a exigir a versão mais nova, tornando necessário desfazer a regressão. A dependência de um componente cuja versão não está sob controle da equipe é risco concreto de indisponibilidade em demonstrações agendadas, mitigado com a desativação da atualização automática no aparelho.</w:t>
+        <w:t>A divergência de SDK ocorreu duas vezes, em sentidos opostos. O aplicativo intermediário usado para executar o projeto em dispositivo físico é distribuído pela loja da fabricante, que mantém apenas a versão mais recente. Quando o projeto foi criado, essa versão era anterior à dele, o que exigiu regredi-lo; semanas depois, o aplicativo atualizou-se automaticamente e passou a exigir a versão mais nova, tornando necessário desfazer a regressão. A dependência de um componente cuja versão não está sob controle da equipe é risco concreto de indisponibilidade em demonstrações agendadas, mitigado com a desativação da atualização automática no aparelho.</w:t>
       </w:r>
     </w:p>
     <w:p>
@@ -10726,7 +10721,7 @@
       <w:pPr>
         <w:pStyle w:val="Ttulo1"/>
       </w:pPr>
-      <w:bookmarkStart w:id="41" w:name="_Toc241225232"/>
+      <w:bookmarkStart w:id="41" w:name="_Toc241227292"/>
       <w:r>
         <w:lastRenderedPageBreak/>
         <w:t>7 ARQUITETURA DE SOFTWARE</w:t>
@@ -10748,7 +10743,7 @@
       <w:pPr>
         <w:pStyle w:val="Ttulo2"/>
       </w:pPr>
-      <w:bookmarkStart w:id="42" w:name="_Toc241225233"/>
+      <w:bookmarkStart w:id="42" w:name="_Toc241227293"/>
       <w:r>
         <w:t>7.1 Situação inicial e motivação</w:t>
       </w:r>
@@ -10792,7 +10787,7 @@
       <w:pPr>
         <w:pStyle w:val="Ttulo2"/>
       </w:pPr>
-      <w:bookmarkStart w:id="43" w:name="_Toc241225234"/>
+      <w:bookmarkStart w:id="43" w:name="_Toc241227294"/>
       <w:r>
         <w:t>7.2 Organização em camadas</w:t>
       </w:r>
@@ -11144,7 +11139,7 @@
       <w:pPr>
         <w:pStyle w:val="Ttulo2"/>
       </w:pPr>
-      <w:bookmarkStart w:id="44" w:name="_Toc241225235"/>
+      <w:bookmarkStart w:id="44" w:name="_Toc241227295"/>
       <w:r>
         <w:lastRenderedPageBreak/>
         <w:t>7.3 Orientação a objetos</w:t>
@@ -11219,7 +11214,7 @@
       <w:pPr>
         <w:pStyle w:val="Ttulo2"/>
       </w:pPr>
-      <w:bookmarkStart w:id="45" w:name="_Toc241225236"/>
+      <w:bookmarkStart w:id="45" w:name="_Toc241227296"/>
       <w:r>
         <w:t>7.4 Modularização</w:t>
       </w:r>
@@ -11246,7 +11241,7 @@
       <w:pPr>
         <w:pStyle w:val="Ttulo2"/>
       </w:pPr>
-      <w:bookmarkStart w:id="46" w:name="_Toc241225237"/>
+      <w:bookmarkStart w:id="46" w:name="_Toc241227297"/>
       <w:r>
         <w:t>7.5 Verificação da refatoração</w:t>
       </w:r>
@@ -11281,7 +11276,7 @@
       <w:pPr>
         <w:pStyle w:val="Ttulo1"/>
       </w:pPr>
-      <w:bookmarkStart w:id="47" w:name="_Toc241225238"/>
+      <w:bookmarkStart w:id="47" w:name="_Toc241227298"/>
       <w:r>
         <w:lastRenderedPageBreak/>
         <w:t>8 PROJETO DO BANCO DE DADOS</w:t>
@@ -11303,7 +11298,7 @@
       <w:pPr>
         <w:pStyle w:val="Ttulo2"/>
       </w:pPr>
-      <w:bookmarkStart w:id="48" w:name="_Toc241225239"/>
+      <w:bookmarkStart w:id="48" w:name="_Toc241227299"/>
       <w:r>
         <w:t>8.1 Justificativa do modelo relacional</w:t>
       </w:r>
@@ -11338,7 +11333,7 @@
       <w:pPr>
         <w:pStyle w:val="Ttulo2"/>
       </w:pPr>
-      <w:bookmarkStart w:id="49" w:name="_Toc241225240"/>
+      <w:bookmarkStart w:id="49" w:name="_Toc241227300"/>
       <w:r>
         <w:t>8.2 Modelo conceitual</w:t>
       </w:r>
@@ -11369,7 +11364,7 @@
           <w:noProof/>
         </w:rPr>
         <w:drawing>
-          <wp:inline distT="0" distB="0" distL="0" distR="0" wp14:anchorId="0D08121D" wp14:editId="52E46741">
+          <wp:inline distT="0" distB="0" distL="0" distR="0" wp14:anchorId="5310AEB3" wp14:editId="26C3580F">
             <wp:extent cx="5400000" cy="3639286"/>
             <wp:effectExtent l="0" t="0" r="0" b="0"/>
             <wp:docPr id="11" name="Imagem 11"/>
@@ -11435,7 +11430,7 @@
       <w:pPr>
         <w:pStyle w:val="Ttulo2"/>
       </w:pPr>
-      <w:bookmarkStart w:id="50" w:name="_Toc241225241"/>
+      <w:bookmarkStart w:id="50" w:name="_Toc241227301"/>
       <w:r>
         <w:t>8.3 Modelo lógico</w:t>
       </w:r>
@@ -11599,7 +11594,7 @@
       <w:pPr>
         <w:pStyle w:val="Ttulo2"/>
       </w:pPr>
-      <w:bookmarkStart w:id="51" w:name="_Toc241225242"/>
+      <w:bookmarkStart w:id="51" w:name="_Toc241227302"/>
       <w:r>
         <w:t>8.4 Modelo físico</w:t>
       </w:r>
@@ -11659,7 +11654,7 @@
         </w:rPr>
         <w:lastRenderedPageBreak/>
         <w:drawing>
-          <wp:inline distT="0" distB="0" distL="0" distR="0" wp14:anchorId="68BFABF0" wp14:editId="016FFDE0">
+          <wp:inline distT="0" distB="0" distL="0" distR="0" wp14:anchorId="2314FFD7" wp14:editId="203AAE8C">
             <wp:extent cx="5400000" cy="4407738"/>
             <wp:effectExtent l="0" t="0" r="0" b="0"/>
             <wp:docPr id="12" name="Imagem 12"/>
@@ -12043,7 +12038,7 @@
       <w:pPr>
         <w:pStyle w:val="Ttulo2"/>
       </w:pPr>
-      <w:bookmarkStart w:id="52" w:name="_Toc241225243"/>
+      <w:bookmarkStart w:id="52" w:name="_Toc241227303"/>
       <w:r>
         <w:t>8.5 Procedimentos armazenados</w:t>
       </w:r>
@@ -12372,7 +12367,7 @@
       <w:pPr>
         <w:pStyle w:val="Ttulo2"/>
       </w:pPr>
-      <w:bookmarkStart w:id="53" w:name="_Toc241225244"/>
+      <w:bookmarkStart w:id="53" w:name="_Toc241227304"/>
       <w:r>
         <w:lastRenderedPageBreak/>
         <w:t>8.6 Gatilhos</w:t>
@@ -12693,7 +12688,7 @@
       <w:pPr>
         <w:pStyle w:val="Ttulo2"/>
       </w:pPr>
-      <w:bookmarkStart w:id="54" w:name="_Toc241225245"/>
+      <w:bookmarkStart w:id="54" w:name="_Toc241227305"/>
       <w:r>
         <w:t>8.7 Verificação</w:t>
       </w:r>
@@ -12704,145 +12699,136 @@
         <w:ind w:firstLine="850"/>
       </w:pPr>
       <w:r>
-        <w:t xml:space="preserve">Aplicados em banco criado do zero, os scripts geraram 13 tabelas, 15 índices, 4 procedimentos, 4 gatilhos e 1 visão. O </w:t>
+        <w:t xml:space="preserve">Aplicados em banco criado do zero, os scripts geraram 13 tabelas, 15 índices, 4 procedimentos, 4 gatilhos e 1 visão, e o </w:t>
       </w:r>
       <w:r>
         <w:rPr>
           <w:rFonts w:ascii="Courier New" w:hAnsi="Courier New" w:cs="Courier New"/>
           <w:sz w:val="22"/>
         </w:rPr>
-        <w:t>sp_RankingGeral</w:t>
-      </w:r>
-      <w:r>
-        <w:t xml:space="preserve"> classificou corretamente em 100% e 66,67%; o </w:t>
+        <w:t>tr_Resultados_Validar</w:t>
+      </w:r>
+      <w:r>
+        <w:t xml:space="preserve"> rejeitou acertos iguais a 999 e a −5. No teste do limite de vagas, </w:t>
+      </w:r>
+      <w:r>
+        <w:rPr>
+          <w:b/>
+        </w:rPr>
+        <w:t>tentou-se inserir 45 estudantes em uma turma</w:t>
+      </w:r>
+      <w:r>
+        <w:t>: o gatilho interrompeu a 41ª inserção, e a regra RN01, que no PIM III era linha de tabela, tornou-se restrição verificável.</w:t>
+      </w:r>
+    </w:p>
+    <w:p>
+      <w:pPr>
+        <w:ind w:firstLine="850"/>
+      </w:pPr>
+      <w:r>
+        <w:t xml:space="preserve">Dois defeitos escaparam a essa verificação por não se manifestarem em consulta. O hash de senha das contas de demonstração provinha de exemplo da documentação do BCrypt, e </w:t>
+      </w:r>
+      <w:r>
+        <w:rPr>
+          <w:b/>
+        </w:rPr>
+        <w:t>nenhuma conta autenticava</w:t>
+      </w:r>
+      <w:r>
+        <w:t xml:space="preserve"> — corrigido gerando o hash com a biblioteca da aplicação e conferindo-o com </w:t>
       </w:r>
       <w:r>
         <w:rPr>
           <w:rFonts w:ascii="Courier New" w:hAnsi="Courier New" w:cs="Courier New"/>
           <w:sz w:val="22"/>
         </w:rPr>
-        <w:t>sp_DesempenhoTurma</w:t>
-      </w:r>
-      <w:r>
-        <w:t xml:space="preserve"> atribuiu as faixas "Destaque" e "Em Progresso"; o </w:t>
+        <w:t>Verify()</w:t>
+      </w:r>
+      <w:r>
+        <w:t xml:space="preserve">. E os gatilhos, corretos isoladamente, </w:t>
+      </w:r>
+      <w:r>
+        <w:rPr>
+          <w:b/>
+        </w:rPr>
+        <w:t>colidiam com o Entity Framework</w:t>
+      </w:r>
+      <w:r>
+        <w:t xml:space="preserve">: desde a versão 7, ele grava alterações com </w:t>
       </w:r>
       <w:r>
         <w:rPr>
           <w:rFonts w:ascii="Courier New" w:hAnsi="Courier New" w:cs="Courier New"/>
           <w:sz w:val="22"/>
         </w:rPr>
-        <w:t>tr_Resultados_Validar</w:t>
-      </w:r>
-      <w:r>
-        <w:t xml:space="preserve"> rejeitou acertos iguais a 999 e a −5; e o </w:t>
+        <w:t>UPDATE ... OUTPUT</w:t>
+      </w:r>
+      <w:r>
+        <w:t>, comando que o SQL Server recusa em tabela com gatilho. Redefinir senha, editar usuário e encerrar sessão falhavam, enquanto o login, que só insere, funcionava — o que ocultou o defeito até a produção. Declarar os gatilhos no mapeamento (</w:t>
       </w:r>
       <w:r>
         <w:rPr>
           <w:rFonts w:ascii="Courier New" w:hAnsi="Courier New" w:cs="Courier New"/>
           <w:sz w:val="22"/>
         </w:rPr>
-        <w:t>tr_Usuarios_Auditoria</w:t>
-      </w:r>
-      <w:r>
-        <w:t xml:space="preserve"> registrou as alterações de situação.</w:t>
-      </w:r>
+        <w:t>HasTrigger</w:t>
+      </w:r>
+      <w:r>
+        <w:t>) o corrigiu.</w:t>
+      </w:r>
+    </w:p>
+    <w:p>
+      <w:pPr>
+        <w:pStyle w:val="Ttulo2"/>
+      </w:pPr>
+      <w:bookmarkStart w:id="55" w:name="_Toc241227306"/>
+      <w:r>
+        <w:t>8.8 Script completo</w:t>
+      </w:r>
+      <w:bookmarkEnd w:id="55"/>
     </w:p>
     <w:p>
       <w:pPr>
         <w:ind w:firstLine="850"/>
       </w:pPr>
       <w:r>
-        <w:t xml:space="preserve">O teste mais significativo foi o do limite de vagas: </w:t>
-      </w:r>
-      <w:r>
-        <w:rPr>
-          <w:b/>
-        </w:rPr>
-        <w:t>tentou-se inserir 45 estudantes em uma turma</w:t>
-      </w:r>
-      <w:r>
-        <w:t>. O gatilho interrompeu a operação na quadragésima primeira inserção, e a contagem final permaneceu em exatamente 40. A regra RN01, que no PIM III era uma linha de tabela, passou a ser restrição verificável.</w:t>
-      </w:r>
-    </w:p>
-    <w:p>
-      <w:pPr>
-        <w:ind w:firstLine="850"/>
-      </w:pPr>
-      <w:r>
-        <w:t xml:space="preserve">A verificação expôs ainda um defeito invisível ao banco: as contas de demonstração eram criadas sem erro, mas </w:t>
-      </w:r>
-      <w:r>
-        <w:rPr>
-          <w:b/>
-        </w:rPr>
-        <w:t>nenhuma conseguia autenticar</w:t>
-      </w:r>
-      <w:r>
-        <w:t xml:space="preserve">, pois o hash de senha fixado no script provinha de um exemplo da documentação do BCrypt. Sendo o hash irreversível, nenhuma consulta o revelaria; só a tentativa de autenticação o evidenciou. A correção gerou o hash com a biblioteca da aplicação e o conferiu com </w:t>
+        <w:t xml:space="preserve">O projeto do banco organiza-se em quatro scripts sequenciais: </w:t>
       </w:r>
       <w:r>
         <w:rPr>
           <w:rFonts w:ascii="Courier New" w:hAnsi="Courier New" w:cs="Courier New"/>
           <w:sz w:val="22"/>
         </w:rPr>
-        <w:t>Verify()</w:t>
-      </w:r>
-      <w:r>
-        <w:t xml:space="preserve"> antes de fixá-lo.</w:t>
-      </w:r>
-    </w:p>
-    <w:p>
-      <w:pPr>
-        <w:pStyle w:val="Ttulo2"/>
-      </w:pPr>
-      <w:bookmarkStart w:id="55" w:name="_Toc241225246"/>
-      <w:r>
-        <w:t>8.8 Script completo</w:t>
-      </w:r>
-      <w:bookmarkEnd w:id="55"/>
-    </w:p>
-    <w:p>
-      <w:pPr>
-        <w:ind w:firstLine="850"/>
-      </w:pPr>
-      <w:r>
-        <w:t xml:space="preserve">O projeto do banco organiza-se em quatro scripts sequenciais: </w:t>
+        <w:t>01_schema.sql</w:t>
+      </w:r>
+      <w:r>
+        <w:t xml:space="preserve">, que cria o banco, as 13 tabelas e os 15 índices; </w:t>
       </w:r>
       <w:r>
         <w:rPr>
           <w:rFonts w:ascii="Courier New" w:hAnsi="Courier New" w:cs="Courier New"/>
           <w:sz w:val="22"/>
         </w:rPr>
-        <w:t>01_schema.sql</w:t>
-      </w:r>
-      <w:r>
-        <w:t xml:space="preserve">, que cria o banco, as 13 tabelas e os 15 índices; </w:t>
+        <w:t>02_procedures_triggers.sql</w:t>
+      </w:r>
+      <w:r>
+        <w:t xml:space="preserve">, com os procedimentos, gatilhos, visão e tabela de auditoria; </w:t>
       </w:r>
       <w:r>
         <w:rPr>
           <w:rFonts w:ascii="Courier New" w:hAnsi="Courier New" w:cs="Courier New"/>
           <w:sz w:val="22"/>
         </w:rPr>
-        <w:t>02_procedures_triggers.sql</w:t>
-      </w:r>
-      <w:r>
-        <w:t xml:space="preserve">, com os procedimentos, gatilhos, visão e tabela de auditoria; </w:t>
+        <w:t>03_carga_inicial.sql</w:t>
+      </w:r>
+      <w:r>
+        <w:t xml:space="preserve">, com os dados de demonstração; e </w:t>
       </w:r>
       <w:r>
         <w:rPr>
           <w:rFonts w:ascii="Courier New" w:hAnsi="Courier New" w:cs="Courier New"/>
           <w:sz w:val="22"/>
         </w:rPr>
-        <w:t>03_carga_inicial.sql</w:t>
-      </w:r>
-      <w:r>
-        <w:t xml:space="preserve">, com os dados de demonstração; e </w:t>
-      </w:r>
-      <w:r>
-        <w:rPr>
-          <w:rFonts w:ascii="Courier New" w:hAnsi="Courier New" w:cs="Courier New"/>
-          <w:sz w:val="22"/>
-        </w:rPr>
         <w:t>04_cenario_farol.sql</w:t>
       </w:r>
       <w:r>
@@ -12879,7 +12865,7 @@
       <w:pPr>
         <w:pStyle w:val="Ttulo1"/>
       </w:pPr>
-      <w:bookmarkStart w:id="56" w:name="_Toc241225247"/>
+      <w:bookmarkStart w:id="56" w:name="_Toc241227307"/>
       <w:r>
         <w:lastRenderedPageBreak/>
         <w:t>9 INFRAESTRUTURA EM NUVEM E DEVOPS</w:t>
@@ -12901,7 +12887,7 @@
       <w:pPr>
         <w:pStyle w:val="Ttulo2"/>
       </w:pPr>
-      <w:bookmarkStart w:id="57" w:name="_Toc241225248"/>
+      <w:bookmarkStart w:id="57" w:name="_Toc241227308"/>
       <w:r>
         <w:t>9.1 Arquitetura em nuvem</w:t>
       </w:r>
@@ -12990,7 +12976,7 @@
       <w:pPr>
         <w:pStyle w:val="Ttulo2"/>
       </w:pPr>
-      <w:bookmarkStart w:id="58" w:name="_Toc241225249"/>
+      <w:bookmarkStart w:id="58" w:name="_Toc241227309"/>
       <w:r>
         <w:t>9.2 Serviços utilizados</w:t>
       </w:r>
@@ -13010,7 +12996,7 @@
         <w:t>Render</w:t>
       </w:r>
       <w:r>
-        <w:t xml:space="preserve">, em modelo de Plataforma como Serviço (PaaS): não dispondo a instituição de equipe dedicada a servidores, o modelo em que o provedor mantém sistema operacional e runtime reduz a carga operacional. O banco de dados é o </w:t>
+        <w:t xml:space="preserve">, em Plataforma como Serviço (PaaS), que dispensa equipe dedicada a servidores. O banco de dados é o </w:t>
       </w:r>
       <w:r>
         <w:rPr>
@@ -13052,7 +13038,7 @@
       <w:pPr>
         <w:pStyle w:val="Ttulo2"/>
       </w:pPr>
-      <w:bookmarkStart w:id="59" w:name="_Toc241225250"/>
+      <w:bookmarkStart w:id="59" w:name="_Toc241227310"/>
       <w:r>
         <w:t>9.3 Contêineres</w:t>
       </w:r>
@@ -13072,25 +13058,7 @@
         <w:t>Docker</w:t>
       </w:r>
       <w:r>
-        <w:t xml:space="preserve">, em construção de múltiplos estágios: o </w:t>
-      </w:r>
-      <w:r>
-        <w:rPr>
-          <w:b/>
-        </w:rPr>
-        <w:t>estágio de compilação</w:t>
-      </w:r>
-      <w:r>
-        <w:t xml:space="preserve"> usa a imagem do SDK do .NET (cerca de 800 MB) para restaurar dependências e publicar a aplicação, e o </w:t>
-      </w:r>
-      <w:r>
-        <w:rPr>
-          <w:b/>
-        </w:rPr>
-        <w:t>estágio de execução</w:t>
-      </w:r>
-      <w:r>
-        <w:t xml:space="preserve"> parte da imagem do runtime (cerca de 220 MB) e recebe apenas os binários publicados. A separação resultou em imagem final de </w:t>
+        <w:t xml:space="preserve">, em construção de múltiplos estágios: a compilação usa a imagem do SDK do .NET (cerca de 800 MB), e a execução parte da imagem do runtime (cerca de 220 MB), recebendo apenas os binários publicados. A imagem final tem </w:t>
       </w:r>
       <w:r>
         <w:rPr>
@@ -13099,11 +13067,7 @@
         <w:t>376 MB</w:t>
       </w:r>
       <w:r>
-        <w:t xml:space="preserve"> e reduziu a superfície de ataque, pois SDK, compiladores e código-fonte não </w:t>
-      </w:r>
-      <w:r>
-        <w:lastRenderedPageBreak/>
-        <w:t xml:space="preserve">integram a imagem publicada. A aplicação executa sob </w:t>
+        <w:t xml:space="preserve"> e não contém SDK, compiladores nem código-fonte, e a aplicação executa sob </w:t>
       </w:r>
       <w:r>
         <w:rPr>
@@ -13112,7 +13076,7 @@
         <w:t>usuário sem privilégios</w:t>
       </w:r>
       <w:r>
-        <w:t>, de modo que um comprometimento não confere privilégios administrativos dentro do contêiner.</w:t>
+        <w:t>.</w:t>
       </w:r>
     </w:p>
     <w:p>
@@ -13157,7 +13121,11 @@
         <w:t>api</w:t>
       </w:r>
       <w:r>
-        <w:t>, que só inicia após a conclusão bem-sucedida do anterior. A sequência garante que a aplicação nunca encontre banco inexistente.</w:t>
+        <w:t xml:space="preserve">, que só inicia após a </w:t>
+      </w:r>
+      <w:r>
+        <w:lastRenderedPageBreak/>
+        <w:t>conclusão bem-sucedida do anterior. A sequência garante que a aplicação nunca encontre banco inexistente.</w:t>
       </w:r>
     </w:p>
     <w:p>
@@ -13177,7 +13145,7 @@
           <w:noProof/>
         </w:rPr>
         <w:drawing>
-          <wp:inline distT="0" distB="0" distL="0" distR="0" wp14:anchorId="05624513" wp14:editId="0610A92D">
+          <wp:inline distT="0" distB="0" distL="0" distR="0" wp14:anchorId="63324489" wp14:editId="51C23D2D">
             <wp:extent cx="5400000" cy="1433929"/>
             <wp:effectExtent l="0" t="0" r="0" b="0"/>
             <wp:docPr id="13" name="Imagem 13"/>
@@ -13231,7 +13199,7 @@
       <w:pPr>
         <w:pStyle w:val="Ttulo2"/>
       </w:pPr>
-      <w:bookmarkStart w:id="60" w:name="_Toc241225251"/>
+      <w:bookmarkStart w:id="60" w:name="_Toc241227311"/>
       <w:r>
         <w:t>9.4 Pipeline de integração e entrega contínuas</w:t>
       </w:r>
@@ -13319,7 +13287,7 @@
       <w:pPr>
         <w:pStyle w:val="Ttulo2"/>
       </w:pPr>
-      <w:bookmarkStart w:id="61" w:name="_Toc241225252"/>
+      <w:bookmarkStart w:id="61" w:name="_Toc241227312"/>
       <w:r>
         <w:t>9.5 Monitoramento</w:t>
       </w:r>
@@ -13357,71 +13325,76 @@
         <w:ind w:firstLine="850"/>
       </w:pPr>
       <w:r>
-        <w:t xml:space="preserve">A implementação inicial verificava apenas a presença do runtime e reportaria saúde com a aplicação inoperante — indicador que nunca acusa falha produz falsa confiança. A versão </w:t>
-      </w:r>
+        <w:t>A implementação inicial verificava apenas a presença do runtime e reportaria saúde com a aplicação inoperante — indicador que nunca acusa falha produz falsa confiança. A versão corrigida foi verificada interrompendo o banco deliberadamente: o endpoint passou de 200 a 503 e voltou a 200.</w:t>
+      </w:r>
+    </w:p>
+    <w:p>
+      <w:pPr>
+        <w:pStyle w:val="Ttulo2"/>
+      </w:pPr>
+      <w:bookmarkStart w:id="62" w:name="_Toc241227313"/>
       <w:r>
         <w:lastRenderedPageBreak/>
-        <w:t>corrigida foi verificada interrompendo o banco deliberadamente: o endpoint passou de 200 a 503 e voltou a 200.</w:t>
+        <w:t>9.6 Escalabilidade</w:t>
+      </w:r>
+      <w:bookmarkEnd w:id="62"/>
+    </w:p>
+    <w:p>
+      <w:pPr>
+        <w:ind w:firstLine="850"/>
+      </w:pPr>
+      <w:r>
+        <w:t>Sem sessão em memória, qualquer instância atende qualquer requisição, e adicionar réplicas não exige coordenação. Em expansão significativa, as medidas seguintes seriam cache distribuído e réplicas de leitura no banco.</w:t>
       </w:r>
     </w:p>
     <w:p>
       <w:pPr>
         <w:pStyle w:val="Ttulo2"/>
       </w:pPr>
-      <w:bookmarkStart w:id="62" w:name="_Toc241225253"/>
-      <w:r>
-        <w:t>9.6 Escalabilidade</w:t>
-      </w:r>
-      <w:bookmarkEnd w:id="62"/>
+      <w:bookmarkStart w:id="63" w:name="_Toc241227314"/>
+      <w:r>
+        <w:t>9.7 Segurança da infraestrutura</w:t>
+      </w:r>
+      <w:bookmarkEnd w:id="63"/>
     </w:p>
     <w:p>
       <w:pPr>
         <w:ind w:firstLine="850"/>
       </w:pPr>
       <w:r>
-        <w:t>Sem sessão em memória, qualquer instância atende qualquer requisição, e adicionar réplicas não exige coordenação. Em expansão significativa, as medidas seguintes seriam cache distribuído e réplicas de leitura no banco.</w:t>
+        <w:t xml:space="preserve">Seis medidas compõem a segurança do ambiente: os segredos permanecem fora do código, cadastrados como variáveis de ambiente no Render; o contêiner executa como usuário comum; a imagem final não contém SDK, compiladores nem código-fonte; a conexão com o banco é cifrada, com validação do certificado do servidor; as dependências passam por varredura automática no pipeline; e o </w:t>
+      </w:r>
+      <w:r>
+        <w:rPr>
+          <w:b/>
+        </w:rPr>
+        <w:t>firewall do banco</w:t>
+      </w:r>
+      <w:r>
+        <w:t xml:space="preserve"> recusa qualquer origem não autorizada, admitindo apenas o endereço da equipe e as faixas de saída do Render.</w:t>
+      </w:r>
+    </w:p>
+    <w:p>
+      <w:pPr>
+        <w:ind w:firstLine="850"/>
+      </w:pPr>
+      <w:r>
+        <w:t>Ressalva: essas faixas são compartilhadas com outros clientes do provedor, e a proteção efetiva recai sobre a credencial do banco; isolamento completo exigiria endereço de saída dedicado, recurso pago.</w:t>
+      </w:r>
+    </w:p>
+    <w:p>
+      <w:pPr>
+        <w:ind w:firstLine="850"/>
+      </w:pPr>
+      <w:r>
+        <w:t>A política de segredos foi posta à prova: uma senha de administrador escrita em script de apresentação chegou ao repositório público. Tratada como comprometida, foi substituída, e a antiga passou a ser recusada. Para as contas de demonstração, criou-se script que troca senha e palavra-chave de recuperação, pois esta bastaria para redefinir aquela.</w:t>
       </w:r>
     </w:p>
     <w:p>
       <w:pPr>
         <w:pStyle w:val="Ttulo2"/>
       </w:pPr>
-      <w:bookmarkStart w:id="63" w:name="_Toc241225254"/>
-      <w:r>
-        <w:t>9.7 Segurança da infraestrutura</w:t>
-      </w:r>
-      <w:bookmarkEnd w:id="63"/>
-    </w:p>
-    <w:p>
-      <w:pPr>
-        <w:ind w:firstLine="850"/>
-      </w:pPr>
-      <w:r>
-        <w:t xml:space="preserve">Seis medidas compõem a segurança do ambiente: os segredos permanecem fora do código, cadastrados como variáveis de ambiente no Render; o contêiner executa como usuário comum; a imagem final não contém SDK, compiladores nem código-fonte; a conexão com o banco é cifrada, com validação do certificado do servidor; as dependências passam por varredura automática no pipeline; e o </w:t>
-      </w:r>
-      <w:r>
-        <w:rPr>
-          <w:b/>
-        </w:rPr>
-        <w:t>firewall do banco</w:t>
-      </w:r>
-      <w:r>
-        <w:t xml:space="preserve"> recusa qualquer origem não autorizada, admitindo apenas o endereço da equipe e as faixas de saída do Render.</w:t>
-      </w:r>
-    </w:p>
-    <w:p>
-      <w:pPr>
-        <w:ind w:firstLine="850"/>
-      </w:pPr>
-      <w:r>
-        <w:t>Ressalva: essas faixas são compartilhadas com outros clientes do provedor, e a proteção efetiva recai sobre a credencial do banco; isolamento completo exigiria endereço de saída dedicado, recurso pago.</w:t>
-      </w:r>
-    </w:p>
-    <w:p>
-      <w:pPr>
-        <w:pStyle w:val="Ttulo2"/>
-      </w:pPr>
-      <w:bookmarkStart w:id="64" w:name="_Toc241225255"/>
+      <w:bookmarkStart w:id="64" w:name="_Toc241227315"/>
       <w:r>
         <w:t>9.8 Verificação do ambiente</w:t>
       </w:r>
@@ -13738,7 +13711,7 @@
               <w:rPr>
                 <w:sz w:val="18"/>
               </w:rPr>
-              <w:t>Consultas autenticadas</w:t>
+              <w:t>Interface web</w:t>
             </w:r>
           </w:p>
         </w:tc>
@@ -13759,7 +13732,7 @@
               <w:rPr>
                 <w:sz w:val="18"/>
               </w:rPr>
-              <w:t>Dados retornados corretamente</w:t>
+              <w:t>Resposta HTTP 200</w:t>
             </w:r>
           </w:p>
         </w:tc>
@@ -13788,7 +13761,7 @@
               <w:rPr>
                 <w:sz w:val="18"/>
               </w:rPr>
-              <w:t>Assistente virtual</w:t>
+              <w:t>Verificação de saúde sob falha</w:t>
             </w:r>
           </w:p>
         </w:tc>
@@ -13809,7 +13782,7 @@
               <w:rPr>
                 <w:sz w:val="18"/>
               </w:rPr>
-              <w:t>Respondeu adequadamente</w:t>
+              <w:t>200 → 503 → 200</w:t>
             </w:r>
           </w:p>
         </w:tc>
@@ -13838,7 +13811,7 @@
               <w:rPr>
                 <w:sz w:val="18"/>
               </w:rPr>
-              <w:t>Interface web</w:t>
+              <w:t>Scripts aplicados no Azure SQL</w:t>
             </w:r>
           </w:p>
         </w:tc>
@@ -13859,7 +13832,7 @@
               <w:rPr>
                 <w:sz w:val="18"/>
               </w:rPr>
-              <w:t>Resposta HTTP 200</w:t>
+              <w:t>Sem alteração: 13 tabelas, 4 procedimentos, 4 gatilhos</w:t>
             </w:r>
           </w:p>
         </w:tc>
@@ -13888,7 +13861,7 @@
               <w:rPr>
                 <w:sz w:val="18"/>
               </w:rPr>
-              <w:t>Verificação de saúde sob falha</w:t>
+              <w:t>Produção, verificação de saúde</w:t>
             </w:r>
           </w:p>
         </w:tc>
@@ -13909,7 +13882,7 @@
               <w:rPr>
                 <w:sz w:val="18"/>
               </w:rPr>
-              <w:t>200 → 503 → 200</w:t>
+              <w:t>200, banco acessível</w:t>
             </w:r>
           </w:p>
         </w:tc>
@@ -13938,106 +13911,6 @@
               <w:rPr>
                 <w:sz w:val="18"/>
               </w:rPr>
-              <w:t>Scripts aplicados no Azure SQL</w:t>
-            </w:r>
-          </w:p>
-        </w:tc>
-        <w:tc>
-          <w:tcPr>
-            <w:tcW w:w="4536" w:type="dxa"/>
-            <w:shd w:val="clear" w:color="auto" w:fill="auto"/>
-          </w:tcPr>
-          <w:p>
-            <w:pPr>
-              <w:spacing w:line="240" w:lineRule="auto"/>
-              <w:jc w:val="left"/>
-              <w:rPr>
-                <w:sz w:val="18"/>
-              </w:rPr>
-            </w:pPr>
-            <w:r>
-              <w:rPr>
-                <w:sz w:val="18"/>
-              </w:rPr>
-              <w:t>Sem alteração: 13 tabelas, 4 procedimentos, 4 gatilhos</w:t>
-            </w:r>
-          </w:p>
-        </w:tc>
-      </w:tr>
-      <w:tr>
-        <w:tblPrEx>
-          <w:tblCellMar>
-            <w:top w:w="0" w:type="dxa"/>
-            <w:bottom w:w="0" w:type="dxa"/>
-          </w:tblCellMar>
-        </w:tblPrEx>
-        <w:tc>
-          <w:tcPr>
-            <w:tcW w:w="4536" w:type="dxa"/>
-            <w:shd w:val="clear" w:color="auto" w:fill="auto"/>
-          </w:tcPr>
-          <w:p>
-            <w:pPr>
-              <w:spacing w:line="240" w:lineRule="auto"/>
-              <w:jc w:val="left"/>
-              <w:rPr>
-                <w:sz w:val="18"/>
-              </w:rPr>
-            </w:pPr>
-            <w:r>
-              <w:rPr>
-                <w:sz w:val="18"/>
-              </w:rPr>
-              <w:t>Produção, verificação de saúde</w:t>
-            </w:r>
-          </w:p>
-        </w:tc>
-        <w:tc>
-          <w:tcPr>
-            <w:tcW w:w="4536" w:type="dxa"/>
-            <w:shd w:val="clear" w:color="auto" w:fill="auto"/>
-          </w:tcPr>
-          <w:p>
-            <w:pPr>
-              <w:spacing w:line="240" w:lineRule="auto"/>
-              <w:jc w:val="left"/>
-              <w:rPr>
-                <w:sz w:val="18"/>
-              </w:rPr>
-            </w:pPr>
-            <w:r>
-              <w:rPr>
-                <w:sz w:val="18"/>
-              </w:rPr>
-              <w:t>200, banco acessível</w:t>
-            </w:r>
-          </w:p>
-        </w:tc>
-      </w:tr>
-      <w:tr>
-        <w:tblPrEx>
-          <w:tblCellMar>
-            <w:top w:w="0" w:type="dxa"/>
-            <w:bottom w:w="0" w:type="dxa"/>
-          </w:tblCellMar>
-        </w:tblPrEx>
-        <w:tc>
-          <w:tcPr>
-            <w:tcW w:w="4536" w:type="dxa"/>
-            <w:shd w:val="clear" w:color="auto" w:fill="auto"/>
-          </w:tcPr>
-          <w:p>
-            <w:pPr>
-              <w:spacing w:line="240" w:lineRule="auto"/>
-              <w:jc w:val="left"/>
-              <w:rPr>
-                <w:sz w:val="18"/>
-              </w:rPr>
-            </w:pPr>
-            <w:r>
-              <w:rPr>
-                <w:sz w:val="18"/>
-              </w:rPr>
               <w:t>Produção, autenticação e farol</w:t>
             </w:r>
           </w:p>
@@ -14100,7 +13973,7 @@
       <w:pPr>
         <w:pStyle w:val="Ttulo1"/>
       </w:pPr>
-      <w:bookmarkStart w:id="65" w:name="_Toc241225256"/>
+      <w:bookmarkStart w:id="65" w:name="_Toc241227316"/>
       <w:r>
         <w:lastRenderedPageBreak/>
         <w:t>10 GERENCIAMENTO ÁGIL DO PROJETO</w:t>
@@ -14122,7 +13995,7 @@
       <w:pPr>
         <w:pStyle w:val="Ttulo2"/>
       </w:pPr>
-      <w:bookmarkStart w:id="66" w:name="_Toc241225257"/>
+      <w:bookmarkStart w:id="66" w:name="_Toc241227317"/>
       <w:r>
         <w:t>10.1 Metodologia adotada</w:t>
       </w:r>
@@ -14175,7 +14048,7 @@
       <w:pPr>
         <w:pStyle w:val="Ttulo2"/>
       </w:pPr>
-      <w:bookmarkStart w:id="67" w:name="_Toc241225258"/>
+      <w:bookmarkStart w:id="67" w:name="_Toc241227318"/>
       <w:r>
         <w:t>10.2 Papéis</w:t>
       </w:r>
@@ -14220,7 +14093,7 @@
       <w:pPr>
         <w:pStyle w:val="Ttulo2"/>
       </w:pPr>
-      <w:bookmarkStart w:id="68" w:name="_Toc241225259"/>
+      <w:bookmarkStart w:id="68" w:name="_Toc241227319"/>
       <w:r>
         <w:t>10.3 Product Backlog</w:t>
       </w:r>
@@ -15668,7 +15541,7 @@
       <w:pPr>
         <w:pStyle w:val="Ttulo2"/>
       </w:pPr>
-      <w:bookmarkStart w:id="69" w:name="_Toc241225260"/>
+      <w:bookmarkStart w:id="69" w:name="_Toc241227320"/>
       <w:r>
         <w:t>10.4 Sprint Backlog</w:t>
       </w:r>
@@ -16296,7 +16169,7 @@
       <w:pPr>
         <w:pStyle w:val="Ttulo2"/>
       </w:pPr>
-      <w:bookmarkStart w:id="70" w:name="_Toc241225261"/>
+      <w:bookmarkStart w:id="70" w:name="_Toc241227321"/>
       <w:r>
         <w:t>10.5 Cronograma</w:t>
       </w:r>
@@ -16855,7 +16728,7 @@
           <w:noProof/>
         </w:rPr>
         <w:drawing>
-          <wp:inline distT="0" distB="0" distL="0" distR="0" wp14:anchorId="6F54E585" wp14:editId="4AD1877E">
+          <wp:inline distT="0" distB="0" distL="0" distR="0" wp14:anchorId="5E328DF8" wp14:editId="75472AD9">
             <wp:extent cx="5400000" cy="2986310"/>
             <wp:effectExtent l="0" t="0" r="0" b="5080"/>
             <wp:docPr id="14" name="Imagem 14"/>
@@ -16909,7 +16782,7 @@
       <w:pPr>
         <w:pStyle w:val="Ttulo2"/>
       </w:pPr>
-      <w:bookmarkStart w:id="71" w:name="_Toc241225262"/>
+      <w:bookmarkStart w:id="71" w:name="_Toc241227322"/>
       <w:r>
         <w:t>10.6 Definição de pronto</w:t>
       </w:r>
@@ -16944,7 +16817,7 @@
       <w:pPr>
         <w:pStyle w:val="Ttulo1"/>
       </w:pPr>
-      <w:bookmarkStart w:id="72" w:name="_Toc241225263"/>
+      <w:bookmarkStart w:id="72" w:name="_Toc241227323"/>
       <w:r>
         <w:lastRenderedPageBreak/>
         <w:t>11 CONCLUSÃO</w:t>
@@ -17050,7 +16923,7 @@
       <w:pPr>
         <w:pStyle w:val="Ttulo1"/>
       </w:pPr>
-      <w:bookmarkStart w:id="73" w:name="_Toc241225264"/>
+      <w:bookmarkStart w:id="73" w:name="_Toc241227324"/>
       <w:r>
         <w:lastRenderedPageBreak/>
         <w:t>REFERÊNCIAS</w:t>
@@ -17360,7 +17233,7 @@
           <w:noProof/>
         </w:rPr>
         <w:drawing>
-          <wp:inline distT="0" distB="0" distL="0" distR="0" wp14:anchorId="479A1DAB" wp14:editId="5F183697">
+          <wp:inline distT="0" distB="0" distL="0" distR="0" wp14:anchorId="0309527F" wp14:editId="49C78F9E">
             <wp:extent cx="4607242" cy="5400000"/>
             <wp:effectExtent l="0" t="0" r="3175" b="0"/>
             <wp:docPr id="15" name="Imagem 15"/>
@@ -18013,7 +17886,7 @@
     <w:link w:val="Ttulo1Char"/>
     <w:uiPriority w:val="9"/>
     <w:qFormat/>
-    <w:rsid w:val="004C3212"/>
+    <w:rsid w:val="009D44C9"/>
     <w:pPr>
       <w:keepNext/>
       <w:keepLines/>
@@ -18036,7 +17909,7 @@
     <w:uiPriority w:val="9"/>
     <w:unhideWhenUsed/>
     <w:qFormat/>
-    <w:rsid w:val="004C3212"/>
+    <w:rsid w:val="009D44C9"/>
     <w:pPr>
       <w:keepNext/>
       <w:keepLines/>
@@ -18059,7 +17932,7 @@
     <w:uiPriority w:val="9"/>
     <w:unhideWhenUsed/>
     <w:qFormat/>
-    <w:rsid w:val="004C3212"/>
+    <w:rsid w:val="009D44C9"/>
     <w:pPr>
       <w:keepNext/>
       <w:keepLines/>
@@ -18106,7 +17979,7 @@
     <w:basedOn w:val="Fontepargpadro"/>
     <w:link w:val="Ttulo1"/>
     <w:uiPriority w:val="9"/>
-    <w:rsid w:val="004C3212"/>
+    <w:rsid w:val="009D44C9"/>
     <w:rPr>
       <w:rFonts w:ascii="Times New Roman" w:eastAsiaTheme="majorEastAsia" w:hAnsi="Times New Roman" w:cs="Times New Roman"/>
       <w:b/>
@@ -18120,7 +17993,7 @@
     <w:basedOn w:val="Fontepargpadro"/>
     <w:link w:val="Ttulo2"/>
     <w:uiPriority w:val="9"/>
-    <w:rsid w:val="004C3212"/>
+    <w:rsid w:val="009D44C9"/>
     <w:rPr>
       <w:rFonts w:ascii="Times New Roman" w:eastAsiaTheme="majorEastAsia" w:hAnsi="Times New Roman" w:cs="Times New Roman"/>
       <w:b/>
@@ -18134,7 +18007,7 @@
     <w:basedOn w:val="Fontepargpadro"/>
     <w:link w:val="Ttulo3"/>
     <w:uiPriority w:val="9"/>
-    <w:rsid w:val="004C3212"/>
+    <w:rsid w:val="009D44C9"/>
     <w:rPr>
       <w:rFonts w:ascii="Times New Roman" w:eastAsiaTheme="majorEastAsia" w:hAnsi="Times New Roman" w:cs="Times New Roman"/>
       <w:i/>
@@ -18151,7 +18024,7 @@
     <w:uiPriority w:val="99"/>
     <w:semiHidden/>
     <w:unhideWhenUsed/>
-    <w:rsid w:val="004C3212"/>
+    <w:rsid w:val="009D44C9"/>
     <w:pPr>
       <w:spacing w:line="240" w:lineRule="auto"/>
       <w:ind w:left="240" w:hanging="240"/>
@@ -18163,7 +18036,7 @@
     <w:next w:val="Remissivo1"/>
     <w:uiPriority w:val="99"/>
     <w:unhideWhenUsed/>
-    <w:rsid w:val="004C3212"/>
+    <w:rsid w:val="009D44C9"/>
     <w:pPr>
       <w:spacing w:line="240" w:lineRule="auto"/>
       <w:jc w:val="center"/>
@@ -18181,7 +18054,7 @@
     <w:link w:val="CabealhoChar"/>
     <w:uiPriority w:val="99"/>
     <w:unhideWhenUsed/>
-    <w:rsid w:val="004C3212"/>
+    <w:rsid w:val="009D44C9"/>
     <w:pPr>
       <w:tabs>
         <w:tab w:val="center" w:pos="4252"/>
@@ -18195,7 +18068,7 @@
     <w:basedOn w:val="Fontepargpadro"/>
     <w:link w:val="Cabealho"/>
     <w:uiPriority w:val="99"/>
-    <w:rsid w:val="004C3212"/>
+    <w:rsid w:val="009D44C9"/>
     <w:rPr>
       <w:rFonts w:ascii="Times New Roman" w:hAnsi="Times New Roman" w:cs="Times New Roman"/>
       <w:sz w:val="24"/>
@@ -18207,7 +18080,7 @@
     <w:link w:val="RodapChar"/>
     <w:uiPriority w:val="99"/>
     <w:unhideWhenUsed/>
-    <w:rsid w:val="004C3212"/>
+    <w:rsid w:val="009D44C9"/>
     <w:pPr>
       <w:tabs>
         <w:tab w:val="center" w:pos="4252"/>
@@ -18221,7 +18094,7 @@
     <w:basedOn w:val="Fontepargpadro"/>
     <w:link w:val="Rodap"/>
     <w:uiPriority w:val="99"/>
-    <w:rsid w:val="004C3212"/>
+    <w:rsid w:val="009D44C9"/>
     <w:rPr>
       <w:rFonts w:ascii="Times New Roman" w:hAnsi="Times New Roman" w:cs="Times New Roman"/>
       <w:sz w:val="24"/>
@@ -18234,7 +18107,7 @@
     <w:autoRedefine/>
     <w:uiPriority w:val="39"/>
     <w:unhideWhenUsed/>
-    <w:rsid w:val="004C3212"/>
+    <w:rsid w:val="009D44C9"/>
     <w:pPr>
       <w:spacing w:after="100"/>
     </w:pPr>
@@ -18246,7 +18119,7 @@
     <w:autoRedefine/>
     <w:uiPriority w:val="39"/>
     <w:unhideWhenUsed/>
-    <w:rsid w:val="004C3212"/>
+    <w:rsid w:val="009D44C9"/>
     <w:pPr>
       <w:spacing w:after="100"/>
       <w:ind w:left="240"/>

</xml_diff>

<commit_message>
Registra no documento a troca das credenciais de demonstracao
Verificado em producao: a senha antiga das contas de demonstracao e a
palavra-chave publica passaram a ser recusadas (401 e 400).

Co-Authored-By: Claude Opus 5.5 <noreply@anthropic.com>
</commit_message>
<xml_diff>
--- a/docs/PIM_IV_documento.docx
+++ b/docs/PIM_IV_documento.docx
@@ -15,7 +15,7 @@
           <w:noProof/>
         </w:rPr>
         <w:drawing>
-          <wp:inline distT="0" distB="0" distL="0" distR="0" wp14:anchorId="0AE4D770" wp14:editId="73864AA9">
+          <wp:inline distT="0" distB="0" distL="0" distR="0" wp14:anchorId="3EA57A54" wp14:editId="2AABD4E6">
             <wp:extent cx="1980000" cy="699722"/>
             <wp:effectExtent l="0" t="0" r="1270" b="5715"/>
             <wp:docPr id="1" name="Imagem 1"/>
@@ -458,7 +458,7 @@
         <w:rPr>
           <w:noProof/>
         </w:rPr>
-        <w:instrText xml:space="preserve"> PAGEREF _Toc241227251 \h </w:instrText>
+        <w:instrText xml:space="preserve"> PAGEREF _Toc241233620 \h </w:instrText>
       </w:r>
       <w:r>
         <w:rPr>
@@ -519,7 +519,7 @@
         <w:rPr>
           <w:noProof/>
         </w:rPr>
-        <w:instrText xml:space="preserve"> PAGEREF _Toc241227252 \h </w:instrText>
+        <w:instrText xml:space="preserve"> PAGEREF _Toc241233621 \h </w:instrText>
       </w:r>
       <w:r>
         <w:rPr>
@@ -580,7 +580,7 @@
         <w:rPr>
           <w:noProof/>
         </w:rPr>
-        <w:instrText xml:space="preserve"> PAGEREF _Toc241227253 \h </w:instrText>
+        <w:instrText xml:space="preserve"> PAGEREF _Toc241233622 \h </w:instrText>
       </w:r>
       <w:r>
         <w:rPr>
@@ -641,7 +641,7 @@
         <w:rPr>
           <w:noProof/>
         </w:rPr>
-        <w:instrText xml:space="preserve"> PAGEREF _Toc241227254 \h </w:instrText>
+        <w:instrText xml:space="preserve"> PAGEREF _Toc241233623 \h </w:instrText>
       </w:r>
       <w:r>
         <w:rPr>
@@ -702,7 +702,7 @@
         <w:rPr>
           <w:noProof/>
         </w:rPr>
-        <w:instrText xml:space="preserve"> PAGEREF _Toc241227255 \h </w:instrText>
+        <w:instrText xml:space="preserve"> PAGEREF _Toc241233624 \h </w:instrText>
       </w:r>
       <w:r>
         <w:rPr>
@@ -763,7 +763,7 @@
         <w:rPr>
           <w:noProof/>
         </w:rPr>
-        <w:instrText xml:space="preserve"> PAGEREF _Toc241227256 \h </w:instrText>
+        <w:instrText xml:space="preserve"> PAGEREF _Toc241233625 \h </w:instrText>
       </w:r>
       <w:r>
         <w:rPr>
@@ -824,7 +824,7 @@
         <w:rPr>
           <w:noProof/>
         </w:rPr>
-        <w:instrText xml:space="preserve"> PAGEREF _Toc241227257 \h </w:instrText>
+        <w:instrText xml:space="preserve"> PAGEREF _Toc241233626 \h </w:instrText>
       </w:r>
       <w:r>
         <w:rPr>
@@ -885,7 +885,7 @@
         <w:rPr>
           <w:noProof/>
         </w:rPr>
-        <w:instrText xml:space="preserve"> PAGEREF _Toc241227258 \h </w:instrText>
+        <w:instrText xml:space="preserve"> PAGEREF _Toc241233627 \h </w:instrText>
       </w:r>
       <w:r>
         <w:rPr>
@@ -946,7 +946,7 @@
         <w:rPr>
           <w:noProof/>
         </w:rPr>
-        <w:instrText xml:space="preserve"> PAGEREF _Toc241227259 \h </w:instrText>
+        <w:instrText xml:space="preserve"> PAGEREF _Toc241233628 \h </w:instrText>
       </w:r>
       <w:r>
         <w:rPr>
@@ -1007,7 +1007,7 @@
         <w:rPr>
           <w:noProof/>
         </w:rPr>
-        <w:instrText xml:space="preserve"> PAGEREF _Toc241227260 \h </w:instrText>
+        <w:instrText xml:space="preserve"> PAGEREF _Toc241233629 \h </w:instrText>
       </w:r>
       <w:r>
         <w:rPr>
@@ -1068,7 +1068,7 @@
         <w:rPr>
           <w:noProof/>
         </w:rPr>
-        <w:instrText xml:space="preserve"> PAGEREF _Toc241227261 \h </w:instrText>
+        <w:instrText xml:space="preserve"> PAGEREF _Toc241233630 \h </w:instrText>
       </w:r>
       <w:r>
         <w:rPr>
@@ -1129,7 +1129,7 @@
         <w:rPr>
           <w:noProof/>
         </w:rPr>
-        <w:instrText xml:space="preserve"> PAGEREF _Toc241227262 \h </w:instrText>
+        <w:instrText xml:space="preserve"> PAGEREF _Toc241233631 \h </w:instrText>
       </w:r>
       <w:r>
         <w:rPr>
@@ -1190,7 +1190,7 @@
         <w:rPr>
           <w:noProof/>
         </w:rPr>
-        <w:instrText xml:space="preserve"> PAGEREF _Toc241227263 \h </w:instrText>
+        <w:instrText xml:space="preserve"> PAGEREF _Toc241233632 \h </w:instrText>
       </w:r>
       <w:r>
         <w:rPr>
@@ -1251,7 +1251,7 @@
         <w:rPr>
           <w:noProof/>
         </w:rPr>
-        <w:instrText xml:space="preserve"> PAGEREF _Toc241227264 \h </w:instrText>
+        <w:instrText xml:space="preserve"> PAGEREF _Toc241233633 \h </w:instrText>
       </w:r>
       <w:r>
         <w:rPr>
@@ -1312,7 +1312,7 @@
         <w:rPr>
           <w:noProof/>
         </w:rPr>
-        <w:instrText xml:space="preserve"> PAGEREF _Toc241227265 \h </w:instrText>
+        <w:instrText xml:space="preserve"> PAGEREF _Toc241233634 \h </w:instrText>
       </w:r>
       <w:r>
         <w:rPr>
@@ -1373,7 +1373,7 @@
         <w:rPr>
           <w:noProof/>
         </w:rPr>
-        <w:instrText xml:space="preserve"> PAGEREF _Toc241227266 \h </w:instrText>
+        <w:instrText xml:space="preserve"> PAGEREF _Toc241233635 \h </w:instrText>
       </w:r>
       <w:r>
         <w:rPr>
@@ -1434,7 +1434,7 @@
         <w:rPr>
           <w:noProof/>
         </w:rPr>
-        <w:instrText xml:space="preserve"> PAGEREF _Toc241227267 \h </w:instrText>
+        <w:instrText xml:space="preserve"> PAGEREF _Toc241233636 \h </w:instrText>
       </w:r>
       <w:r>
         <w:rPr>
@@ -1495,7 +1495,7 @@
         <w:rPr>
           <w:noProof/>
         </w:rPr>
-        <w:instrText xml:space="preserve"> PAGEREF _Toc241227268 \h </w:instrText>
+        <w:instrText xml:space="preserve"> PAGEREF _Toc241233637 \h </w:instrText>
       </w:r>
       <w:r>
         <w:rPr>
@@ -1556,7 +1556,7 @@
         <w:rPr>
           <w:noProof/>
         </w:rPr>
-        <w:instrText xml:space="preserve"> PAGEREF _Toc241227269 \h </w:instrText>
+        <w:instrText xml:space="preserve"> PAGEREF _Toc241233638 \h </w:instrText>
       </w:r>
       <w:r>
         <w:rPr>
@@ -1617,7 +1617,7 @@
         <w:rPr>
           <w:noProof/>
         </w:rPr>
-        <w:instrText xml:space="preserve"> PAGEREF _Toc241227270 \h </w:instrText>
+        <w:instrText xml:space="preserve"> PAGEREF _Toc241233639 \h </w:instrText>
       </w:r>
       <w:r>
         <w:rPr>
@@ -1678,7 +1678,7 @@
         <w:rPr>
           <w:noProof/>
         </w:rPr>
-        <w:instrText xml:space="preserve"> PAGEREF _Toc241227271 \h </w:instrText>
+        <w:instrText xml:space="preserve"> PAGEREF _Toc241233640 \h </w:instrText>
       </w:r>
       <w:r>
         <w:rPr>
@@ -1739,7 +1739,7 @@
         <w:rPr>
           <w:noProof/>
         </w:rPr>
-        <w:instrText xml:space="preserve"> PAGEREF _Toc241227272 \h </w:instrText>
+        <w:instrText xml:space="preserve"> PAGEREF _Toc241233641 \h </w:instrText>
       </w:r>
       <w:r>
         <w:rPr>
@@ -1800,7 +1800,7 @@
         <w:rPr>
           <w:noProof/>
         </w:rPr>
-        <w:instrText xml:space="preserve"> PAGEREF _Toc241227273 \h </w:instrText>
+        <w:instrText xml:space="preserve"> PAGEREF _Toc241233642 \h </w:instrText>
       </w:r>
       <w:r>
         <w:rPr>
@@ -1861,7 +1861,7 @@
         <w:rPr>
           <w:noProof/>
         </w:rPr>
-        <w:instrText xml:space="preserve"> PAGEREF _Toc241227274 \h </w:instrText>
+        <w:instrText xml:space="preserve"> PAGEREF _Toc241233643 \h </w:instrText>
       </w:r>
       <w:r>
         <w:rPr>
@@ -1922,7 +1922,7 @@
         <w:rPr>
           <w:noProof/>
         </w:rPr>
-        <w:instrText xml:space="preserve"> PAGEREF _Toc241227275 \h </w:instrText>
+        <w:instrText xml:space="preserve"> PAGEREF _Toc241233644 \h </w:instrText>
       </w:r>
       <w:r>
         <w:rPr>
@@ -1983,7 +1983,7 @@
         <w:rPr>
           <w:noProof/>
         </w:rPr>
-        <w:instrText xml:space="preserve"> PAGEREF _Toc241227276 \h </w:instrText>
+        <w:instrText xml:space="preserve"> PAGEREF _Toc241233645 \h </w:instrText>
       </w:r>
       <w:r>
         <w:rPr>
@@ -2045,7 +2045,7 @@
         <w:rPr>
           <w:noProof/>
         </w:rPr>
-        <w:instrText xml:space="preserve"> PAGEREF _Toc241227277 \h </w:instrText>
+        <w:instrText xml:space="preserve"> PAGEREF _Toc241233646 \h </w:instrText>
       </w:r>
       <w:r>
         <w:rPr>
@@ -2106,7 +2106,7 @@
         <w:rPr>
           <w:noProof/>
         </w:rPr>
-        <w:instrText xml:space="preserve"> PAGEREF _Toc241227278 \h </w:instrText>
+        <w:instrText xml:space="preserve"> PAGEREF _Toc241233647 \h </w:instrText>
       </w:r>
       <w:r>
         <w:rPr>
@@ -2167,7 +2167,7 @@
         <w:rPr>
           <w:noProof/>
         </w:rPr>
-        <w:instrText xml:space="preserve"> PAGEREF _Toc241227279 \h </w:instrText>
+        <w:instrText xml:space="preserve"> PAGEREF _Toc241233648 \h </w:instrText>
       </w:r>
       <w:r>
         <w:rPr>
@@ -2228,7 +2228,7 @@
         <w:rPr>
           <w:noProof/>
         </w:rPr>
-        <w:instrText xml:space="preserve"> PAGEREF _Toc241227280 \h </w:instrText>
+        <w:instrText xml:space="preserve"> PAGEREF _Toc241233649 \h </w:instrText>
       </w:r>
       <w:r>
         <w:rPr>
@@ -2289,7 +2289,7 @@
         <w:rPr>
           <w:noProof/>
         </w:rPr>
-        <w:instrText xml:space="preserve"> PAGEREF _Toc241227281 \h </w:instrText>
+        <w:instrText xml:space="preserve"> PAGEREF _Toc241233650 \h </w:instrText>
       </w:r>
       <w:r>
         <w:rPr>
@@ -2350,7 +2350,7 @@
         <w:rPr>
           <w:noProof/>
         </w:rPr>
-        <w:instrText xml:space="preserve"> PAGEREF _Toc241227282 \h </w:instrText>
+        <w:instrText xml:space="preserve"> PAGEREF _Toc241233651 \h </w:instrText>
       </w:r>
       <w:r>
         <w:rPr>
@@ -2411,7 +2411,7 @@
         <w:rPr>
           <w:noProof/>
         </w:rPr>
-        <w:instrText xml:space="preserve"> PAGEREF _Toc241227283 \h </w:instrText>
+        <w:instrText xml:space="preserve"> PAGEREF _Toc241233652 \h </w:instrText>
       </w:r>
       <w:r>
         <w:rPr>
@@ -2472,7 +2472,7 @@
         <w:rPr>
           <w:noProof/>
         </w:rPr>
-        <w:instrText xml:space="preserve"> PAGEREF _Toc241227284 \h </w:instrText>
+        <w:instrText xml:space="preserve"> PAGEREF _Toc241233653 \h </w:instrText>
       </w:r>
       <w:r>
         <w:rPr>
@@ -2533,7 +2533,7 @@
         <w:rPr>
           <w:noProof/>
         </w:rPr>
-        <w:instrText xml:space="preserve"> PAGEREF _Toc241227285 \h </w:instrText>
+        <w:instrText xml:space="preserve"> PAGEREF _Toc241233654 \h </w:instrText>
       </w:r>
       <w:r>
         <w:rPr>
@@ -2594,7 +2594,7 @@
         <w:rPr>
           <w:noProof/>
         </w:rPr>
-        <w:instrText xml:space="preserve"> PAGEREF _Toc241227286 \h </w:instrText>
+        <w:instrText xml:space="preserve"> PAGEREF _Toc241233655 \h </w:instrText>
       </w:r>
       <w:r>
         <w:rPr>
@@ -2655,7 +2655,7 @@
         <w:rPr>
           <w:noProof/>
         </w:rPr>
-        <w:instrText xml:space="preserve"> PAGEREF _Toc241227287 \h </w:instrText>
+        <w:instrText xml:space="preserve"> PAGEREF _Toc241233656 \h </w:instrText>
       </w:r>
       <w:r>
         <w:rPr>
@@ -2716,7 +2716,7 @@
         <w:rPr>
           <w:noProof/>
         </w:rPr>
-        <w:instrText xml:space="preserve"> PAGEREF _Toc241227288 \h </w:instrText>
+        <w:instrText xml:space="preserve"> PAGEREF _Toc241233657 \h </w:instrText>
       </w:r>
       <w:r>
         <w:rPr>
@@ -2777,7 +2777,7 @@
         <w:rPr>
           <w:noProof/>
         </w:rPr>
-        <w:instrText xml:space="preserve"> PAGEREF _Toc241227289 \h </w:instrText>
+        <w:instrText xml:space="preserve"> PAGEREF _Toc241233658 \h </w:instrText>
       </w:r>
       <w:r>
         <w:rPr>
@@ -2838,7 +2838,7 @@
         <w:rPr>
           <w:noProof/>
         </w:rPr>
-        <w:instrText xml:space="preserve"> PAGEREF _Toc241227290 \h </w:instrText>
+        <w:instrText xml:space="preserve"> PAGEREF _Toc241233659 \h </w:instrText>
       </w:r>
       <w:r>
         <w:rPr>
@@ -2899,7 +2899,7 @@
         <w:rPr>
           <w:noProof/>
         </w:rPr>
-        <w:instrText xml:space="preserve"> PAGEREF _Toc241227291 \h </w:instrText>
+        <w:instrText xml:space="preserve"> PAGEREF _Toc241233660 \h </w:instrText>
       </w:r>
       <w:r>
         <w:rPr>
@@ -2960,7 +2960,7 @@
         <w:rPr>
           <w:noProof/>
         </w:rPr>
-        <w:instrText xml:space="preserve"> PAGEREF _Toc241227292 \h </w:instrText>
+        <w:instrText xml:space="preserve"> PAGEREF _Toc241233661 \h </w:instrText>
       </w:r>
       <w:r>
         <w:rPr>
@@ -3021,7 +3021,7 @@
         <w:rPr>
           <w:noProof/>
         </w:rPr>
-        <w:instrText xml:space="preserve"> PAGEREF _Toc241227293 \h </w:instrText>
+        <w:instrText xml:space="preserve"> PAGEREF _Toc241233662 \h </w:instrText>
       </w:r>
       <w:r>
         <w:rPr>
@@ -3082,7 +3082,7 @@
         <w:rPr>
           <w:noProof/>
         </w:rPr>
-        <w:instrText xml:space="preserve"> PAGEREF _Toc241227294 \h </w:instrText>
+        <w:instrText xml:space="preserve"> PAGEREF _Toc241233663 \h </w:instrText>
       </w:r>
       <w:r>
         <w:rPr>
@@ -3143,7 +3143,7 @@
         <w:rPr>
           <w:noProof/>
         </w:rPr>
-        <w:instrText xml:space="preserve"> PAGEREF _Toc241227295 \h </w:instrText>
+        <w:instrText xml:space="preserve"> PAGEREF _Toc241233664 \h </w:instrText>
       </w:r>
       <w:r>
         <w:rPr>
@@ -3204,7 +3204,7 @@
         <w:rPr>
           <w:noProof/>
         </w:rPr>
-        <w:instrText xml:space="preserve"> PAGEREF _Toc241227296 \h </w:instrText>
+        <w:instrText xml:space="preserve"> PAGEREF _Toc241233665 \h </w:instrText>
       </w:r>
       <w:r>
         <w:rPr>
@@ -3265,7 +3265,7 @@
         <w:rPr>
           <w:noProof/>
         </w:rPr>
-        <w:instrText xml:space="preserve"> PAGEREF _Toc241227297 \h </w:instrText>
+        <w:instrText xml:space="preserve"> PAGEREF _Toc241233666 \h </w:instrText>
       </w:r>
       <w:r>
         <w:rPr>
@@ -3326,7 +3326,7 @@
         <w:rPr>
           <w:noProof/>
         </w:rPr>
-        <w:instrText xml:space="preserve"> PAGEREF _Toc241227298 \h </w:instrText>
+        <w:instrText xml:space="preserve"> PAGEREF _Toc241233667 \h </w:instrText>
       </w:r>
       <w:r>
         <w:rPr>
@@ -3387,7 +3387,7 @@
         <w:rPr>
           <w:noProof/>
         </w:rPr>
-        <w:instrText xml:space="preserve"> PAGEREF _Toc241227299 \h </w:instrText>
+        <w:instrText xml:space="preserve"> PAGEREF _Toc241233668 \h </w:instrText>
       </w:r>
       <w:r>
         <w:rPr>
@@ -3448,7 +3448,7 @@
         <w:rPr>
           <w:noProof/>
         </w:rPr>
-        <w:instrText xml:space="preserve"> PAGEREF _Toc241227300 \h </w:instrText>
+        <w:instrText xml:space="preserve"> PAGEREF _Toc241233669 \h </w:instrText>
       </w:r>
       <w:r>
         <w:rPr>
@@ -3509,7 +3509,7 @@
         <w:rPr>
           <w:noProof/>
         </w:rPr>
-        <w:instrText xml:space="preserve"> PAGEREF _Toc241227301 \h </w:instrText>
+        <w:instrText xml:space="preserve"> PAGEREF _Toc241233670 \h </w:instrText>
       </w:r>
       <w:r>
         <w:rPr>
@@ -3570,7 +3570,7 @@
         <w:rPr>
           <w:noProof/>
         </w:rPr>
-        <w:instrText xml:space="preserve"> PAGEREF _Toc241227302 \h </w:instrText>
+        <w:instrText xml:space="preserve"> PAGEREF _Toc241233671 \h </w:instrText>
       </w:r>
       <w:r>
         <w:rPr>
@@ -3631,7 +3631,7 @@
         <w:rPr>
           <w:noProof/>
         </w:rPr>
-        <w:instrText xml:space="preserve"> PAGEREF _Toc241227303 \h </w:instrText>
+        <w:instrText xml:space="preserve"> PAGEREF _Toc241233672 \h </w:instrText>
       </w:r>
       <w:r>
         <w:rPr>
@@ -3693,7 +3693,7 @@
         <w:rPr>
           <w:noProof/>
         </w:rPr>
-        <w:instrText xml:space="preserve"> PAGEREF _Toc241227304 \h </w:instrText>
+        <w:instrText xml:space="preserve"> PAGEREF _Toc241233673 \h </w:instrText>
       </w:r>
       <w:r>
         <w:rPr>
@@ -3754,7 +3754,7 @@
         <w:rPr>
           <w:noProof/>
         </w:rPr>
-        <w:instrText xml:space="preserve"> PAGEREF _Toc241227305 \h </w:instrText>
+        <w:instrText xml:space="preserve"> PAGEREF _Toc241233674 \h </w:instrText>
       </w:r>
       <w:r>
         <w:rPr>
@@ -3815,7 +3815,7 @@
         <w:rPr>
           <w:noProof/>
         </w:rPr>
-        <w:instrText xml:space="preserve"> PAGEREF _Toc241227306 \h </w:instrText>
+        <w:instrText xml:space="preserve"> PAGEREF _Toc241233675 \h </w:instrText>
       </w:r>
       <w:r>
         <w:rPr>
@@ -3876,7 +3876,7 @@
         <w:rPr>
           <w:noProof/>
         </w:rPr>
-        <w:instrText xml:space="preserve"> PAGEREF _Toc241227307 \h </w:instrText>
+        <w:instrText xml:space="preserve"> PAGEREF _Toc241233676 \h </w:instrText>
       </w:r>
       <w:r>
         <w:rPr>
@@ -3937,7 +3937,7 @@
         <w:rPr>
           <w:noProof/>
         </w:rPr>
-        <w:instrText xml:space="preserve"> PAGEREF _Toc241227308 \h </w:instrText>
+        <w:instrText xml:space="preserve"> PAGEREF _Toc241233677 \h </w:instrText>
       </w:r>
       <w:r>
         <w:rPr>
@@ -3998,7 +3998,7 @@
         <w:rPr>
           <w:noProof/>
         </w:rPr>
-        <w:instrText xml:space="preserve"> PAGEREF _Toc241227309 \h </w:instrText>
+        <w:instrText xml:space="preserve"> PAGEREF _Toc241233678 \h </w:instrText>
       </w:r>
       <w:r>
         <w:rPr>
@@ -4059,7 +4059,7 @@
         <w:rPr>
           <w:noProof/>
         </w:rPr>
-        <w:instrText xml:space="preserve"> PAGEREF _Toc241227310 \h </w:instrText>
+        <w:instrText xml:space="preserve"> PAGEREF _Toc241233679 \h </w:instrText>
       </w:r>
       <w:r>
         <w:rPr>
@@ -4120,7 +4120,7 @@
         <w:rPr>
           <w:noProof/>
         </w:rPr>
-        <w:instrText xml:space="preserve"> PAGEREF _Toc241227311 \h </w:instrText>
+        <w:instrText xml:space="preserve"> PAGEREF _Toc241233680 \h </w:instrText>
       </w:r>
       <w:r>
         <w:rPr>
@@ -4181,7 +4181,7 @@
         <w:rPr>
           <w:noProof/>
         </w:rPr>
-        <w:instrText xml:space="preserve"> PAGEREF _Toc241227312 \h </w:instrText>
+        <w:instrText xml:space="preserve"> PAGEREF _Toc241233681 \h </w:instrText>
       </w:r>
       <w:r>
         <w:rPr>
@@ -4242,7 +4242,7 @@
         <w:rPr>
           <w:noProof/>
         </w:rPr>
-        <w:instrText xml:space="preserve"> PAGEREF _Toc241227313 \h </w:instrText>
+        <w:instrText xml:space="preserve"> PAGEREF _Toc241233682 \h </w:instrText>
       </w:r>
       <w:r>
         <w:rPr>
@@ -4303,7 +4303,7 @@
         <w:rPr>
           <w:noProof/>
         </w:rPr>
-        <w:instrText xml:space="preserve"> PAGEREF _Toc241227314 \h </w:instrText>
+        <w:instrText xml:space="preserve"> PAGEREF _Toc241233683 \h </w:instrText>
       </w:r>
       <w:r>
         <w:rPr>
@@ -4364,7 +4364,7 @@
         <w:rPr>
           <w:noProof/>
         </w:rPr>
-        <w:instrText xml:space="preserve"> PAGEREF _Toc241227315 \h </w:instrText>
+        <w:instrText xml:space="preserve"> PAGEREF _Toc241233684 \h </w:instrText>
       </w:r>
       <w:r>
         <w:rPr>
@@ -4425,7 +4425,7 @@
         <w:rPr>
           <w:noProof/>
         </w:rPr>
-        <w:instrText xml:space="preserve"> PAGEREF _Toc241227316 \h </w:instrText>
+        <w:instrText xml:space="preserve"> PAGEREF _Toc241233685 \h </w:instrText>
       </w:r>
       <w:r>
         <w:rPr>
@@ -4486,7 +4486,7 @@
         <w:rPr>
           <w:noProof/>
         </w:rPr>
-        <w:instrText xml:space="preserve"> PAGEREF _Toc241227317 \h </w:instrText>
+        <w:instrText xml:space="preserve"> PAGEREF _Toc241233686 \h </w:instrText>
       </w:r>
       <w:r>
         <w:rPr>
@@ -4547,7 +4547,7 @@
         <w:rPr>
           <w:noProof/>
         </w:rPr>
-        <w:instrText xml:space="preserve"> PAGEREF _Toc241227318 \h </w:instrText>
+        <w:instrText xml:space="preserve"> PAGEREF _Toc241233687 \h </w:instrText>
       </w:r>
       <w:r>
         <w:rPr>
@@ -4608,7 +4608,7 @@
         <w:rPr>
           <w:noProof/>
         </w:rPr>
-        <w:instrText xml:space="preserve"> PAGEREF _Toc241227319 \h </w:instrText>
+        <w:instrText xml:space="preserve"> PAGEREF _Toc241233688 \h </w:instrText>
       </w:r>
       <w:r>
         <w:rPr>
@@ -4669,7 +4669,7 @@
         <w:rPr>
           <w:noProof/>
         </w:rPr>
-        <w:instrText xml:space="preserve"> PAGEREF _Toc241227320 \h </w:instrText>
+        <w:instrText xml:space="preserve"> PAGEREF _Toc241233689 \h </w:instrText>
       </w:r>
       <w:r>
         <w:rPr>
@@ -4730,7 +4730,7 @@
         <w:rPr>
           <w:noProof/>
         </w:rPr>
-        <w:instrText xml:space="preserve"> PAGEREF _Toc241227321 \h </w:instrText>
+        <w:instrText xml:space="preserve"> PAGEREF _Toc241233690 \h </w:instrText>
       </w:r>
       <w:r>
         <w:rPr>
@@ -4791,7 +4791,7 @@
         <w:rPr>
           <w:noProof/>
         </w:rPr>
-        <w:instrText xml:space="preserve"> PAGEREF _Toc241227322 \h </w:instrText>
+        <w:instrText xml:space="preserve"> PAGEREF _Toc241233691 \h </w:instrText>
       </w:r>
       <w:r>
         <w:rPr>
@@ -4852,7 +4852,7 @@
         <w:rPr>
           <w:noProof/>
         </w:rPr>
-        <w:instrText xml:space="preserve"> PAGEREF _Toc241227323 \h </w:instrText>
+        <w:instrText xml:space="preserve"> PAGEREF _Toc241233692 \h </w:instrText>
       </w:r>
       <w:r>
         <w:rPr>
@@ -4913,7 +4913,7 @@
         <w:rPr>
           <w:noProof/>
         </w:rPr>
-        <w:instrText xml:space="preserve"> PAGEREF _Toc241227324 \h </w:instrText>
+        <w:instrText xml:space="preserve"> PAGEREF _Toc241233693 \h </w:instrText>
       </w:r>
       <w:r>
         <w:rPr>
@@ -4997,7 +4997,7 @@
       <w:pPr>
         <w:pStyle w:val="Ttulo1"/>
       </w:pPr>
-      <w:bookmarkStart w:id="0" w:name="_Toc241227251"/>
+      <w:bookmarkStart w:id="0" w:name="_Toc241233620"/>
       <w:r>
         <w:lastRenderedPageBreak/>
         <w:t>1 INTRODUÇÃO</w:t>
@@ -5069,7 +5069,7 @@
       <w:pPr>
         <w:pStyle w:val="Ttulo1"/>
       </w:pPr>
-      <w:bookmarkStart w:id="1" w:name="_Toc241227252"/>
+      <w:bookmarkStart w:id="1" w:name="_Toc241233621"/>
       <w:r>
         <w:lastRenderedPageBreak/>
         <w:t>2 CARACTERIZAÇÃO DA ORGANIZAÇÃO</w:t>
@@ -5080,7 +5080,7 @@
       <w:pPr>
         <w:pStyle w:val="Ttulo2"/>
       </w:pPr>
-      <w:bookmarkStart w:id="2" w:name="_Toc241227253"/>
+      <w:bookmarkStart w:id="2" w:name="_Toc241233622"/>
       <w:r>
         <w:t>2.1 Segmento de atuação</w:t>
       </w:r>
@@ -5106,7 +5106,7 @@
       <w:pPr>
         <w:pStyle w:val="Ttulo2"/>
       </w:pPr>
-      <w:bookmarkStart w:id="3" w:name="_Toc241227254"/>
+      <w:bookmarkStart w:id="3" w:name="_Toc241233623"/>
       <w:r>
         <w:t>2.2 Produtos e serviços</w:t>
       </w:r>
@@ -5124,7 +5124,7 @@
       <w:pPr>
         <w:pStyle w:val="Ttulo2"/>
       </w:pPr>
-      <w:bookmarkStart w:id="4" w:name="_Toc241227255"/>
+      <w:bookmarkStart w:id="4" w:name="_Toc241233624"/>
       <w:r>
         <w:t>2.3 Estrutura organizacional</w:t>
       </w:r>
@@ -5177,7 +5177,7 @@
       <w:pPr>
         <w:pStyle w:val="Ttulo2"/>
       </w:pPr>
-      <w:bookmarkStart w:id="5" w:name="_Toc241227256"/>
+      <w:bookmarkStart w:id="5" w:name="_Toc241233625"/>
       <w:r>
         <w:t>2.4 Principais processos</w:t>
       </w:r>
@@ -5235,7 +5235,7 @@
       <w:pPr>
         <w:pStyle w:val="Ttulo2"/>
       </w:pPr>
-      <w:bookmarkStart w:id="6" w:name="_Toc241227257"/>
+      <w:bookmarkStart w:id="6" w:name="_Toc241233626"/>
       <w:r>
         <w:t>2.5 Problemas identificados</w:t>
       </w:r>
@@ -5307,7 +5307,7 @@
       <w:pPr>
         <w:pStyle w:val="Ttulo2"/>
       </w:pPr>
-      <w:bookmarkStart w:id="7" w:name="_Toc241227258"/>
+      <w:bookmarkStart w:id="7" w:name="_Toc241233627"/>
       <w:r>
         <w:t>2.6 Oportunidades de melhoria por meio da tecnologia</w:t>
       </w:r>
@@ -5877,7 +5877,7 @@
       <w:pPr>
         <w:pStyle w:val="Ttulo1"/>
       </w:pPr>
-      <w:bookmarkStart w:id="8" w:name="_Toc241227259"/>
+      <w:bookmarkStart w:id="8" w:name="_Toc241233628"/>
       <w:r>
         <w:lastRenderedPageBreak/>
         <w:t>3 PLANEJAMENTO DA SOLUÇÃO TECNOLÓGICA</w:t>
@@ -5899,7 +5899,7 @@
       <w:pPr>
         <w:pStyle w:val="Ttulo2"/>
       </w:pPr>
-      <w:bookmarkStart w:id="9" w:name="_Toc241227260"/>
+      <w:bookmarkStart w:id="9" w:name="_Toc241233629"/>
       <w:r>
         <w:t>3.1 Problema a ser resolvido</w:t>
       </w:r>
@@ -5926,7 +5926,7 @@
       <w:pPr>
         <w:pStyle w:val="Ttulo2"/>
       </w:pPr>
-      <w:bookmarkStart w:id="10" w:name="_Toc241227261"/>
+      <w:bookmarkStart w:id="10" w:name="_Toc241233630"/>
       <w:r>
         <w:t>3.2 Objetivos da solução</w:t>
       </w:r>
@@ -5964,7 +5964,7 @@
       <w:pPr>
         <w:pStyle w:val="Ttulo2"/>
       </w:pPr>
-      <w:bookmarkStart w:id="11" w:name="_Toc241227262"/>
+      <w:bookmarkStart w:id="11" w:name="_Toc241233631"/>
       <w:r>
         <w:t>3.3 Público-alvo</w:t>
       </w:r>
@@ -6009,7 +6009,7 @@
       <w:pPr>
         <w:pStyle w:val="Ttulo2"/>
       </w:pPr>
-      <w:bookmarkStart w:id="12" w:name="_Toc241227263"/>
+      <w:bookmarkStart w:id="12" w:name="_Toc241233632"/>
       <w:r>
         <w:t>3.4 Proposta de valor</w:t>
       </w:r>
@@ -6063,7 +6063,7 @@
       <w:pPr>
         <w:pStyle w:val="Ttulo2"/>
       </w:pPr>
-      <w:bookmarkStart w:id="13" w:name="_Toc241227264"/>
+      <w:bookmarkStart w:id="13" w:name="_Toc241233633"/>
       <w:r>
         <w:lastRenderedPageBreak/>
         <w:t>3.5 Benefícios esperados</w:t>
@@ -6617,7 +6617,7 @@
       <w:pPr>
         <w:pStyle w:val="Ttulo2"/>
       </w:pPr>
-      <w:bookmarkStart w:id="14" w:name="_Toc241227265"/>
+      <w:bookmarkStart w:id="14" w:name="_Toc241233634"/>
       <w:r>
         <w:t>3.6 Diferenciais competitivos</w:t>
       </w:r>
@@ -6680,7 +6680,7 @@
       <w:pPr>
         <w:pStyle w:val="Ttulo2"/>
       </w:pPr>
-      <w:bookmarkStart w:id="15" w:name="_Toc241227266"/>
+      <w:bookmarkStart w:id="15" w:name="_Toc241233635"/>
       <w:r>
         <w:t>3.7 Modelo de negócio e viabilidade</w:t>
       </w:r>
@@ -7147,7 +7147,7 @@
       <w:pPr>
         <w:pStyle w:val="Ttulo1"/>
       </w:pPr>
-      <w:bookmarkStart w:id="16" w:name="_Toc241227267"/>
+      <w:bookmarkStart w:id="16" w:name="_Toc241233636"/>
       <w:r>
         <w:lastRenderedPageBreak/>
         <w:t>4 RESPONSABILIDADE SOCIAL E DIVERSIDADE</w:t>
@@ -7169,7 +7169,7 @@
       <w:pPr>
         <w:pStyle w:val="Ttulo2"/>
       </w:pPr>
-      <w:bookmarkStart w:id="17" w:name="_Toc241227268"/>
+      <w:bookmarkStart w:id="17" w:name="_Toc241233637"/>
       <w:r>
         <w:t>4.1 Combate à discriminação</w:t>
       </w:r>
@@ -7223,7 +7223,7 @@
       <w:pPr>
         <w:pStyle w:val="Ttulo2"/>
       </w:pPr>
-      <w:bookmarkStart w:id="18" w:name="_Toc241227269"/>
+      <w:bookmarkStart w:id="18" w:name="_Toc241233638"/>
       <w:r>
         <w:t>4.2 Valorização da diversidade</w:t>
       </w:r>
@@ -7268,7 +7268,7 @@
       <w:pPr>
         <w:pStyle w:val="Ttulo2"/>
       </w:pPr>
-      <w:bookmarkStart w:id="19" w:name="_Toc241227270"/>
+      <w:bookmarkStart w:id="19" w:name="_Toc241233639"/>
       <w:r>
         <w:t>4.3 Recursos tecnológicos inclusivos</w:t>
       </w:r>
@@ -7331,7 +7331,7 @@
       <w:pPr>
         <w:pStyle w:val="Ttulo2"/>
       </w:pPr>
-      <w:bookmarkStart w:id="20" w:name="_Toc241227271"/>
+      <w:bookmarkStart w:id="20" w:name="_Toc241233640"/>
       <w:r>
         <w:lastRenderedPageBreak/>
         <w:t>4.4 Ações voltadas à acessibilidade</w:t>
@@ -7635,7 +7635,7 @@
       <w:pPr>
         <w:pStyle w:val="Ttulo2"/>
       </w:pPr>
-      <w:bookmarkStart w:id="21" w:name="_Toc241227272"/>
+      <w:bookmarkStart w:id="21" w:name="_Toc241233641"/>
       <w:r>
         <w:t>4.5 Tecnologia para a promoção da cidadania</w:t>
       </w:r>
@@ -7680,7 +7680,7 @@
       <w:pPr>
         <w:pStyle w:val="Ttulo2"/>
       </w:pPr>
-      <w:bookmarkStart w:id="22" w:name="_Toc241227273"/>
+      <w:bookmarkStart w:id="22" w:name="_Toc241233642"/>
       <w:r>
         <w:t>4.6 Farol de Evasão</w:t>
       </w:r>
@@ -8280,7 +8280,7 @@
           <w:noProof/>
         </w:rPr>
         <w:drawing>
-          <wp:inline distT="0" distB="0" distL="0" distR="0" wp14:anchorId="728BA24A" wp14:editId="2DE45415">
+          <wp:inline distT="0" distB="0" distL="0" distR="0" wp14:anchorId="6C5AFB98" wp14:editId="73B90034">
             <wp:extent cx="5400000" cy="2256548"/>
             <wp:effectExtent l="0" t="0" r="0" b="0"/>
             <wp:docPr id="2" name="Imagem 2"/>
@@ -8343,7 +8343,7 @@
       <w:pPr>
         <w:pStyle w:val="Ttulo1"/>
       </w:pPr>
-      <w:bookmarkStart w:id="23" w:name="_Toc241227274"/>
+      <w:bookmarkStart w:id="23" w:name="_Toc241233643"/>
       <w:r>
         <w:lastRenderedPageBreak/>
         <w:t>5 DESENVOLVIMENTO DA SOLUÇÃO WEB</w:t>
@@ -8365,7 +8365,7 @@
       <w:pPr>
         <w:pStyle w:val="Ttulo2"/>
       </w:pPr>
-      <w:bookmarkStart w:id="24" w:name="_Toc241227275"/>
+      <w:bookmarkStart w:id="24" w:name="_Toc241233644"/>
       <w:r>
         <w:t>5.1 Arquitetura da aplicação</w:t>
       </w:r>
@@ -8430,7 +8430,7 @@
           <w:noProof/>
         </w:rPr>
         <w:drawing>
-          <wp:inline distT="0" distB="0" distL="0" distR="0" wp14:anchorId="0BEBC48E" wp14:editId="3E2008E5">
+          <wp:inline distT="0" distB="0" distL="0" distR="0" wp14:anchorId="42B47FC6" wp14:editId="49C13D8F">
             <wp:extent cx="5400000" cy="2633929"/>
             <wp:effectExtent l="0" t="0" r="0" b="0"/>
             <wp:docPr id="3" name="Imagem 3"/>
@@ -8484,7 +8484,7 @@
       <w:pPr>
         <w:pStyle w:val="Ttulo2"/>
       </w:pPr>
-      <w:bookmarkStart w:id="25" w:name="_Toc241227276"/>
+      <w:bookmarkStart w:id="25" w:name="_Toc241233645"/>
       <w:r>
         <w:lastRenderedPageBreak/>
         <w:t>5.2 Interface de programação REST</w:t>
@@ -9409,7 +9409,7 @@
       <w:pPr>
         <w:pStyle w:val="Ttulo2"/>
       </w:pPr>
-      <w:bookmarkStart w:id="26" w:name="_Toc241227277"/>
+      <w:bookmarkStart w:id="26" w:name="_Toc241233646"/>
       <w:r>
         <w:t>5.3 Autenticação</w:t>
       </w:r>
@@ -9470,7 +9470,7 @@
       <w:pPr>
         <w:pStyle w:val="Ttulo2"/>
       </w:pPr>
-      <w:bookmarkStart w:id="27" w:name="_Toc241227278"/>
+      <w:bookmarkStart w:id="27" w:name="_Toc241233647"/>
       <w:r>
         <w:t>5.4 Segurança</w:t>
       </w:r>
@@ -9581,7 +9581,7 @@
       <w:pPr>
         <w:pStyle w:val="Ttulo2"/>
       </w:pPr>
-      <w:bookmarkStart w:id="28" w:name="_Toc241227279"/>
+      <w:bookmarkStart w:id="28" w:name="_Toc241233648"/>
       <w:r>
         <w:t>5.5 Estrutura administrativa</w:t>
       </w:r>
@@ -9623,7 +9623,7 @@
         </w:rPr>
         <w:lastRenderedPageBreak/>
         <w:drawing>
-          <wp:inline distT="0" distB="0" distL="0" distR="0" wp14:anchorId="529297D3" wp14:editId="04C64F36">
+          <wp:inline distT="0" distB="0" distL="0" distR="0" wp14:anchorId="7EE2C280" wp14:editId="05BF72E5">
             <wp:extent cx="5400000" cy="2680952"/>
             <wp:effectExtent l="0" t="0" r="0" b="5715"/>
             <wp:docPr id="4" name="Imagem 4"/>
@@ -9677,7 +9677,7 @@
       <w:pPr>
         <w:pStyle w:val="Ttulo2"/>
       </w:pPr>
-      <w:bookmarkStart w:id="29" w:name="_Toc241227280"/>
+      <w:bookmarkStart w:id="29" w:name="_Toc241233649"/>
       <w:r>
         <w:t>5.6 Assistente virtual</w:t>
       </w:r>
@@ -9782,7 +9782,7 @@
           <w:noProof/>
         </w:rPr>
         <w:drawing>
-          <wp:inline distT="0" distB="0" distL="0" distR="0" wp14:anchorId="764B48A7" wp14:editId="4DCA93E2">
+          <wp:inline distT="0" distB="0" distL="0" distR="0" wp14:anchorId="71222884" wp14:editId="3E71BC25">
             <wp:extent cx="5400000" cy="2645238"/>
             <wp:effectExtent l="0" t="0" r="0" b="3175"/>
             <wp:docPr id="5" name="Imagem 5"/>
@@ -9836,7 +9836,7 @@
       <w:pPr>
         <w:pStyle w:val="Ttulo2"/>
       </w:pPr>
-      <w:bookmarkStart w:id="30" w:name="_Toc241227281"/>
+      <w:bookmarkStart w:id="30" w:name="_Toc241233650"/>
       <w:r>
         <w:t>5.7 Integração entre módulos</w:t>
       </w:r>
@@ -9854,7 +9854,7 @@
       <w:pPr>
         <w:pStyle w:val="Ttulo2"/>
       </w:pPr>
-      <w:bookmarkStart w:id="31" w:name="_Toc241227282"/>
+      <w:bookmarkStart w:id="31" w:name="_Toc241233651"/>
       <w:r>
         <w:t>5.8 Correções decorrentes de teste em dispositivo real</w:t>
       </w:r>
@@ -9947,7 +9947,7 @@
       <w:pPr>
         <w:pStyle w:val="Ttulo1"/>
       </w:pPr>
-      <w:bookmarkStart w:id="32" w:name="_Toc241227283"/>
+      <w:bookmarkStart w:id="32" w:name="_Toc241233652"/>
       <w:r>
         <w:lastRenderedPageBreak/>
         <w:t>6 DESENVOLVIMENTO DA SOLUÇÃO MOBILE</w:t>
@@ -9969,7 +9969,7 @@
       <w:pPr>
         <w:pStyle w:val="Ttulo2"/>
       </w:pPr>
-      <w:bookmarkStart w:id="33" w:name="_Toc241227284"/>
+      <w:bookmarkStart w:id="33" w:name="_Toc241233653"/>
       <w:r>
         <w:t>6.1 Tecnologia adotada e justificativa</w:t>
       </w:r>
@@ -10022,7 +10022,7 @@
       <w:pPr>
         <w:pStyle w:val="Ttulo2"/>
       </w:pPr>
-      <w:bookmarkStart w:id="34" w:name="_Toc241227285"/>
+      <w:bookmarkStart w:id="34" w:name="_Toc241233654"/>
       <w:r>
         <w:t>6.2 Telas principais</w:t>
       </w:r>
@@ -10144,7 +10144,7 @@
               </w:rPr>
               <w:lastRenderedPageBreak/>
               <w:drawing>
-                <wp:inline distT="0" distB="0" distL="0" distR="0" wp14:anchorId="2BFFB2F9" wp14:editId="5A81E452">
+                <wp:inline distT="0" distB="0" distL="0" distR="0" wp14:anchorId="132C099A" wp14:editId="27D33750">
                   <wp:extent cx="1831474" cy="3960000"/>
                   <wp:effectExtent l="0" t="0" r="0" b="2540"/>
                   <wp:docPr id="7" name="Imagem 7"/>
@@ -10190,7 +10190,7 @@
                 <w:noProof/>
               </w:rPr>
               <w:drawing>
-                <wp:inline distT="0" distB="0" distL="0" distR="0" wp14:anchorId="6FF3324D" wp14:editId="412FFB89">
+                <wp:inline distT="0" distB="0" distL="0" distR="0" wp14:anchorId="28EDB93D" wp14:editId="559AAB61">
                   <wp:extent cx="1828973" cy="3960001"/>
                   <wp:effectExtent l="0" t="0" r="0" b="2540"/>
                   <wp:docPr id="6" name="Imagem 6"/>
@@ -10269,7 +10269,7 @@
               </w:rPr>
               <w:lastRenderedPageBreak/>
               <w:drawing>
-                <wp:inline distT="0" distB="0" distL="0" distR="0" wp14:anchorId="30219339" wp14:editId="3B2A2326">
+                <wp:inline distT="0" distB="0" distL="0" distR="0" wp14:anchorId="2A1E6BCA" wp14:editId="1CD9050F">
                   <wp:extent cx="1831474" cy="3960000"/>
                   <wp:effectExtent l="0" t="0" r="0" b="2540"/>
                   <wp:docPr id="9" name="Imagem 9"/>
@@ -10315,7 +10315,7 @@
                 <w:noProof/>
               </w:rPr>
               <w:drawing>
-                <wp:inline distT="0" distB="0" distL="0" distR="0" wp14:anchorId="35A4903F" wp14:editId="05966981">
+                <wp:inline distT="0" distB="0" distL="0" distR="0" wp14:anchorId="5E7C0131" wp14:editId="0F838616">
                   <wp:extent cx="1831474" cy="3960000"/>
                   <wp:effectExtent l="0" t="0" r="0" b="2540"/>
                   <wp:docPr id="8" name="Imagem 8"/>
@@ -10389,7 +10389,7 @@
       <w:pPr>
         <w:pStyle w:val="Ttulo2"/>
       </w:pPr>
-      <w:bookmarkStart w:id="35" w:name="_Toc241227286"/>
+      <w:bookmarkStart w:id="35" w:name="_Toc241233655"/>
       <w:r>
         <w:lastRenderedPageBreak/>
         <w:t>6.3 Fluxo de navegação</w:t>
@@ -10434,7 +10434,7 @@
       <w:pPr>
         <w:pStyle w:val="Ttulo2"/>
       </w:pPr>
-      <w:bookmarkStart w:id="36" w:name="_Toc241227287"/>
+      <w:bookmarkStart w:id="36" w:name="_Toc241233656"/>
       <w:r>
         <w:t>6.4 Autenticação e armazenamento seguro</w:t>
       </w:r>
@@ -10489,7 +10489,7 @@
       <w:pPr>
         <w:pStyle w:val="Ttulo2"/>
       </w:pPr>
-      <w:bookmarkStart w:id="37" w:name="_Toc241227288"/>
+      <w:bookmarkStart w:id="37" w:name="_Toc241233657"/>
       <w:r>
         <w:t>6.5 Sincronização de dados</w:t>
       </w:r>
@@ -10525,7 +10525,7 @@
       <w:pPr>
         <w:pStyle w:val="Ttulo2"/>
       </w:pPr>
-      <w:bookmarkStart w:id="38" w:name="_Toc241227289"/>
+      <w:bookmarkStart w:id="38" w:name="_Toc241233658"/>
       <w:r>
         <w:t>6.6 Integração com a interface de programação</w:t>
       </w:r>
@@ -10555,7 +10555,7 @@
       <w:pPr>
         <w:pStyle w:val="Ttulo2"/>
       </w:pPr>
-      <w:bookmarkStart w:id="39" w:name="_Toc241227290"/>
+      <w:bookmarkStart w:id="39" w:name="_Toc241233659"/>
       <w:r>
         <w:t>6.7 Acessibilidade no aplicativo</w:t>
       </w:r>
@@ -10586,7 +10586,7 @@
           <w:noProof/>
         </w:rPr>
         <w:drawing>
-          <wp:inline distT="0" distB="0" distL="0" distR="0" wp14:anchorId="5A03CF5A" wp14:editId="08075922">
+          <wp:inline distT="0" distB="0" distL="0" distR="0" wp14:anchorId="33AD21AD" wp14:editId="2E5C5F2E">
             <wp:extent cx="2497558" cy="5400000"/>
             <wp:effectExtent l="0" t="0" r="0" b="0"/>
             <wp:docPr id="10" name="Imagem 10"/>
@@ -10660,7 +10660,7 @@
       <w:pPr>
         <w:pStyle w:val="Ttulo2"/>
       </w:pPr>
-      <w:bookmarkStart w:id="40" w:name="_Toc241227291"/>
+      <w:bookmarkStart w:id="40" w:name="_Toc241233660"/>
       <w:r>
         <w:t>6.8 Verificação</w:t>
       </w:r>
@@ -10721,7 +10721,7 @@
       <w:pPr>
         <w:pStyle w:val="Ttulo1"/>
       </w:pPr>
-      <w:bookmarkStart w:id="41" w:name="_Toc241227292"/>
+      <w:bookmarkStart w:id="41" w:name="_Toc241233661"/>
       <w:r>
         <w:lastRenderedPageBreak/>
         <w:t>7 ARQUITETURA DE SOFTWARE</w:t>
@@ -10743,7 +10743,7 @@
       <w:pPr>
         <w:pStyle w:val="Ttulo2"/>
       </w:pPr>
-      <w:bookmarkStart w:id="42" w:name="_Toc241227293"/>
+      <w:bookmarkStart w:id="42" w:name="_Toc241233662"/>
       <w:r>
         <w:t>7.1 Situação inicial e motivação</w:t>
       </w:r>
@@ -10787,7 +10787,7 @@
       <w:pPr>
         <w:pStyle w:val="Ttulo2"/>
       </w:pPr>
-      <w:bookmarkStart w:id="43" w:name="_Toc241227294"/>
+      <w:bookmarkStart w:id="43" w:name="_Toc241233663"/>
       <w:r>
         <w:t>7.2 Organização em camadas</w:t>
       </w:r>
@@ -11139,7 +11139,7 @@
       <w:pPr>
         <w:pStyle w:val="Ttulo2"/>
       </w:pPr>
-      <w:bookmarkStart w:id="44" w:name="_Toc241227295"/>
+      <w:bookmarkStart w:id="44" w:name="_Toc241233664"/>
       <w:r>
         <w:lastRenderedPageBreak/>
         <w:t>7.3 Orientação a objetos</w:t>
@@ -11214,7 +11214,7 @@
       <w:pPr>
         <w:pStyle w:val="Ttulo2"/>
       </w:pPr>
-      <w:bookmarkStart w:id="45" w:name="_Toc241227296"/>
+      <w:bookmarkStart w:id="45" w:name="_Toc241233665"/>
       <w:r>
         <w:t>7.4 Modularização</w:t>
       </w:r>
@@ -11241,7 +11241,7 @@
       <w:pPr>
         <w:pStyle w:val="Ttulo2"/>
       </w:pPr>
-      <w:bookmarkStart w:id="46" w:name="_Toc241227297"/>
+      <w:bookmarkStart w:id="46" w:name="_Toc241233666"/>
       <w:r>
         <w:t>7.5 Verificação da refatoração</w:t>
       </w:r>
@@ -11276,7 +11276,7 @@
       <w:pPr>
         <w:pStyle w:val="Ttulo1"/>
       </w:pPr>
-      <w:bookmarkStart w:id="47" w:name="_Toc241227298"/>
+      <w:bookmarkStart w:id="47" w:name="_Toc241233667"/>
       <w:r>
         <w:lastRenderedPageBreak/>
         <w:t>8 PROJETO DO BANCO DE DADOS</w:t>
@@ -11298,7 +11298,7 @@
       <w:pPr>
         <w:pStyle w:val="Ttulo2"/>
       </w:pPr>
-      <w:bookmarkStart w:id="48" w:name="_Toc241227299"/>
+      <w:bookmarkStart w:id="48" w:name="_Toc241233668"/>
       <w:r>
         <w:t>8.1 Justificativa do modelo relacional</w:t>
       </w:r>
@@ -11333,7 +11333,7 @@
       <w:pPr>
         <w:pStyle w:val="Ttulo2"/>
       </w:pPr>
-      <w:bookmarkStart w:id="49" w:name="_Toc241227300"/>
+      <w:bookmarkStart w:id="49" w:name="_Toc241233669"/>
       <w:r>
         <w:t>8.2 Modelo conceitual</w:t>
       </w:r>
@@ -11364,7 +11364,7 @@
           <w:noProof/>
         </w:rPr>
         <w:drawing>
-          <wp:inline distT="0" distB="0" distL="0" distR="0" wp14:anchorId="5310AEB3" wp14:editId="26C3580F">
+          <wp:inline distT="0" distB="0" distL="0" distR="0" wp14:anchorId="00031F24" wp14:editId="70CA34BB">
             <wp:extent cx="5400000" cy="3639286"/>
             <wp:effectExtent l="0" t="0" r="0" b="0"/>
             <wp:docPr id="11" name="Imagem 11"/>
@@ -11430,7 +11430,7 @@
       <w:pPr>
         <w:pStyle w:val="Ttulo2"/>
       </w:pPr>
-      <w:bookmarkStart w:id="50" w:name="_Toc241227301"/>
+      <w:bookmarkStart w:id="50" w:name="_Toc241233670"/>
       <w:r>
         <w:t>8.3 Modelo lógico</w:t>
       </w:r>
@@ -11594,7 +11594,7 @@
       <w:pPr>
         <w:pStyle w:val="Ttulo2"/>
       </w:pPr>
-      <w:bookmarkStart w:id="51" w:name="_Toc241227302"/>
+      <w:bookmarkStart w:id="51" w:name="_Toc241233671"/>
       <w:r>
         <w:t>8.4 Modelo físico</w:t>
       </w:r>
@@ -11654,7 +11654,7 @@
         </w:rPr>
         <w:lastRenderedPageBreak/>
         <w:drawing>
-          <wp:inline distT="0" distB="0" distL="0" distR="0" wp14:anchorId="2314FFD7" wp14:editId="203AAE8C">
+          <wp:inline distT="0" distB="0" distL="0" distR="0" wp14:anchorId="04553007" wp14:editId="1A2EBDFE">
             <wp:extent cx="5400000" cy="4407738"/>
             <wp:effectExtent l="0" t="0" r="0" b="0"/>
             <wp:docPr id="12" name="Imagem 12"/>
@@ -12038,7 +12038,7 @@
       <w:pPr>
         <w:pStyle w:val="Ttulo2"/>
       </w:pPr>
-      <w:bookmarkStart w:id="52" w:name="_Toc241227303"/>
+      <w:bookmarkStart w:id="52" w:name="_Toc241233672"/>
       <w:r>
         <w:t>8.5 Procedimentos armazenados</w:t>
       </w:r>
@@ -12367,7 +12367,7 @@
       <w:pPr>
         <w:pStyle w:val="Ttulo2"/>
       </w:pPr>
-      <w:bookmarkStart w:id="53" w:name="_Toc241227304"/>
+      <w:bookmarkStart w:id="53" w:name="_Toc241233673"/>
       <w:r>
         <w:lastRenderedPageBreak/>
         <w:t>8.6 Gatilhos</w:t>
@@ -12688,7 +12688,7 @@
       <w:pPr>
         <w:pStyle w:val="Ttulo2"/>
       </w:pPr>
-      <w:bookmarkStart w:id="54" w:name="_Toc241227305"/>
+      <w:bookmarkStart w:id="54" w:name="_Toc241233674"/>
       <w:r>
         <w:t>8.7 Verificação</w:t>
       </w:r>
@@ -12781,7 +12781,7 @@
       <w:pPr>
         <w:pStyle w:val="Ttulo2"/>
       </w:pPr>
-      <w:bookmarkStart w:id="55" w:name="_Toc241227306"/>
+      <w:bookmarkStart w:id="55" w:name="_Toc241233675"/>
       <w:r>
         <w:t>8.8 Script completo</w:t>
       </w:r>
@@ -12865,7 +12865,7 @@
       <w:pPr>
         <w:pStyle w:val="Ttulo1"/>
       </w:pPr>
-      <w:bookmarkStart w:id="56" w:name="_Toc241227307"/>
+      <w:bookmarkStart w:id="56" w:name="_Toc241233676"/>
       <w:r>
         <w:lastRenderedPageBreak/>
         <w:t>9 INFRAESTRUTURA EM NUVEM E DEVOPS</w:t>
@@ -12887,7 +12887,7 @@
       <w:pPr>
         <w:pStyle w:val="Ttulo2"/>
       </w:pPr>
-      <w:bookmarkStart w:id="57" w:name="_Toc241227308"/>
+      <w:bookmarkStart w:id="57" w:name="_Toc241233677"/>
       <w:r>
         <w:t>9.1 Arquitetura em nuvem</w:t>
       </w:r>
@@ -12976,7 +12976,7 @@
       <w:pPr>
         <w:pStyle w:val="Ttulo2"/>
       </w:pPr>
-      <w:bookmarkStart w:id="58" w:name="_Toc241227309"/>
+      <w:bookmarkStart w:id="58" w:name="_Toc241233678"/>
       <w:r>
         <w:t>9.2 Serviços utilizados</w:t>
       </w:r>
@@ -13038,7 +13038,7 @@
       <w:pPr>
         <w:pStyle w:val="Ttulo2"/>
       </w:pPr>
-      <w:bookmarkStart w:id="59" w:name="_Toc241227310"/>
+      <w:bookmarkStart w:id="59" w:name="_Toc241233679"/>
       <w:r>
         <w:t>9.3 Contêineres</w:t>
       </w:r>
@@ -13145,7 +13145,7 @@
           <w:noProof/>
         </w:rPr>
         <w:drawing>
-          <wp:inline distT="0" distB="0" distL="0" distR="0" wp14:anchorId="63324489" wp14:editId="51C23D2D">
+          <wp:inline distT="0" distB="0" distL="0" distR="0" wp14:anchorId="703C088C" wp14:editId="6FD75A36">
             <wp:extent cx="5400000" cy="1433929"/>
             <wp:effectExtent l="0" t="0" r="0" b="0"/>
             <wp:docPr id="13" name="Imagem 13"/>
@@ -13199,7 +13199,7 @@
       <w:pPr>
         <w:pStyle w:val="Ttulo2"/>
       </w:pPr>
-      <w:bookmarkStart w:id="60" w:name="_Toc241227311"/>
+      <w:bookmarkStart w:id="60" w:name="_Toc241233680"/>
       <w:r>
         <w:t>9.4 Pipeline de integração e entrega contínuas</w:t>
       </w:r>
@@ -13287,7 +13287,7 @@
       <w:pPr>
         <w:pStyle w:val="Ttulo2"/>
       </w:pPr>
-      <w:bookmarkStart w:id="61" w:name="_Toc241227312"/>
+      <w:bookmarkStart w:id="61" w:name="_Toc241233681"/>
       <w:r>
         <w:t>9.5 Monitoramento</w:t>
       </w:r>
@@ -13332,7 +13332,7 @@
       <w:pPr>
         <w:pStyle w:val="Ttulo2"/>
       </w:pPr>
-      <w:bookmarkStart w:id="62" w:name="_Toc241227313"/>
+      <w:bookmarkStart w:id="62" w:name="_Toc241233682"/>
       <w:r>
         <w:lastRenderedPageBreak/>
         <w:t>9.6 Escalabilidade</w:t>
@@ -13351,7 +13351,7 @@
       <w:pPr>
         <w:pStyle w:val="Ttulo2"/>
       </w:pPr>
-      <w:bookmarkStart w:id="63" w:name="_Toc241227314"/>
+      <w:bookmarkStart w:id="63" w:name="_Toc241233683"/>
       <w:r>
         <w:t>9.7 Segurança da infraestrutura</w:t>
       </w:r>
@@ -13387,14 +13387,14 @@
         <w:ind w:firstLine="850"/>
       </w:pPr>
       <w:r>
-        <w:t>A política de segredos foi posta à prova: uma senha de administrador escrita em script de apresentação chegou ao repositório público. Tratada como comprometida, foi substituída, e a antiga passou a ser recusada. Para as contas de demonstração, criou-se script que troca senha e palavra-chave de recuperação, pois esta bastaria para redefinir aquela.</w:t>
+        <w:t>A política de segredos foi posta à prova: uma senha de administrador escrita em script de apresentação chegou ao repositório público. Tratada como comprometida, foi substituída. Nas contas de demonstração, trocaram-se senha e palavra-chave de recuperação; as antigas passaram a ser recusadas.</w:t>
       </w:r>
     </w:p>
     <w:p>
       <w:pPr>
         <w:pStyle w:val="Ttulo2"/>
       </w:pPr>
-      <w:bookmarkStart w:id="64" w:name="_Toc241227315"/>
+      <w:bookmarkStart w:id="64" w:name="_Toc241233684"/>
       <w:r>
         <w:t>9.8 Verificação do ambiente</w:t>
       </w:r>
@@ -13973,7 +13973,7 @@
       <w:pPr>
         <w:pStyle w:val="Ttulo1"/>
       </w:pPr>
-      <w:bookmarkStart w:id="65" w:name="_Toc241227316"/>
+      <w:bookmarkStart w:id="65" w:name="_Toc241233685"/>
       <w:r>
         <w:lastRenderedPageBreak/>
         <w:t>10 GERENCIAMENTO ÁGIL DO PROJETO</w:t>
@@ -13995,7 +13995,7 @@
       <w:pPr>
         <w:pStyle w:val="Ttulo2"/>
       </w:pPr>
-      <w:bookmarkStart w:id="66" w:name="_Toc241227317"/>
+      <w:bookmarkStart w:id="66" w:name="_Toc241233686"/>
       <w:r>
         <w:t>10.1 Metodologia adotada</w:t>
       </w:r>
@@ -14048,7 +14048,7 @@
       <w:pPr>
         <w:pStyle w:val="Ttulo2"/>
       </w:pPr>
-      <w:bookmarkStart w:id="67" w:name="_Toc241227318"/>
+      <w:bookmarkStart w:id="67" w:name="_Toc241233687"/>
       <w:r>
         <w:t>10.2 Papéis</w:t>
       </w:r>
@@ -14093,7 +14093,7 @@
       <w:pPr>
         <w:pStyle w:val="Ttulo2"/>
       </w:pPr>
-      <w:bookmarkStart w:id="68" w:name="_Toc241227319"/>
+      <w:bookmarkStart w:id="68" w:name="_Toc241233688"/>
       <w:r>
         <w:t>10.3 Product Backlog</w:t>
       </w:r>
@@ -15541,7 +15541,7 @@
       <w:pPr>
         <w:pStyle w:val="Ttulo2"/>
       </w:pPr>
-      <w:bookmarkStart w:id="69" w:name="_Toc241227320"/>
+      <w:bookmarkStart w:id="69" w:name="_Toc241233689"/>
       <w:r>
         <w:t>10.4 Sprint Backlog</w:t>
       </w:r>
@@ -16169,7 +16169,7 @@
       <w:pPr>
         <w:pStyle w:val="Ttulo2"/>
       </w:pPr>
-      <w:bookmarkStart w:id="70" w:name="_Toc241227321"/>
+      <w:bookmarkStart w:id="70" w:name="_Toc241233690"/>
       <w:r>
         <w:t>10.5 Cronograma</w:t>
       </w:r>
@@ -16728,7 +16728,7 @@
           <w:noProof/>
         </w:rPr>
         <w:drawing>
-          <wp:inline distT="0" distB="0" distL="0" distR="0" wp14:anchorId="5E328DF8" wp14:editId="75472AD9">
+          <wp:inline distT="0" distB="0" distL="0" distR="0" wp14:anchorId="6C5CE499" wp14:editId="41821C84">
             <wp:extent cx="5400000" cy="2986310"/>
             <wp:effectExtent l="0" t="0" r="0" b="5080"/>
             <wp:docPr id="14" name="Imagem 14"/>
@@ -16782,7 +16782,7 @@
       <w:pPr>
         <w:pStyle w:val="Ttulo2"/>
       </w:pPr>
-      <w:bookmarkStart w:id="71" w:name="_Toc241227322"/>
+      <w:bookmarkStart w:id="71" w:name="_Toc241233691"/>
       <w:r>
         <w:t>10.6 Definição de pronto</w:t>
       </w:r>
@@ -16817,7 +16817,7 @@
       <w:pPr>
         <w:pStyle w:val="Ttulo1"/>
       </w:pPr>
-      <w:bookmarkStart w:id="72" w:name="_Toc241227323"/>
+      <w:bookmarkStart w:id="72" w:name="_Toc241233692"/>
       <w:r>
         <w:lastRenderedPageBreak/>
         <w:t>11 CONCLUSÃO</w:t>
@@ -16923,7 +16923,7 @@
       <w:pPr>
         <w:pStyle w:val="Ttulo1"/>
       </w:pPr>
-      <w:bookmarkStart w:id="73" w:name="_Toc241227324"/>
+      <w:bookmarkStart w:id="73" w:name="_Toc241233693"/>
       <w:r>
         <w:lastRenderedPageBreak/>
         <w:t>REFERÊNCIAS</w:t>
@@ -17233,7 +17233,7 @@
           <w:noProof/>
         </w:rPr>
         <w:drawing>
-          <wp:inline distT="0" distB="0" distL="0" distR="0" wp14:anchorId="0309527F" wp14:editId="49C78F9E">
+          <wp:inline distT="0" distB="0" distL="0" distR="0" wp14:anchorId="55AA9A3D" wp14:editId="570C67D2">
             <wp:extent cx="4607242" cy="5400000"/>
             <wp:effectExtent l="0" t="0" r="3175" b="0"/>
             <wp:docPr id="15" name="Imagem 15"/>
@@ -17886,7 +17886,7 @@
     <w:link w:val="Ttulo1Char"/>
     <w:uiPriority w:val="9"/>
     <w:qFormat/>
-    <w:rsid w:val="009D44C9"/>
+    <w:rsid w:val="004E5EDB"/>
     <w:pPr>
       <w:keepNext/>
       <w:keepLines/>
@@ -17909,7 +17909,7 @@
     <w:uiPriority w:val="9"/>
     <w:unhideWhenUsed/>
     <w:qFormat/>
-    <w:rsid w:val="009D44C9"/>
+    <w:rsid w:val="004E5EDB"/>
     <w:pPr>
       <w:keepNext/>
       <w:keepLines/>
@@ -17932,7 +17932,7 @@
     <w:uiPriority w:val="9"/>
     <w:unhideWhenUsed/>
     <w:qFormat/>
-    <w:rsid w:val="009D44C9"/>
+    <w:rsid w:val="004E5EDB"/>
     <w:pPr>
       <w:keepNext/>
       <w:keepLines/>
@@ -17979,7 +17979,7 @@
     <w:basedOn w:val="Fontepargpadro"/>
     <w:link w:val="Ttulo1"/>
     <w:uiPriority w:val="9"/>
-    <w:rsid w:val="009D44C9"/>
+    <w:rsid w:val="004E5EDB"/>
     <w:rPr>
       <w:rFonts w:ascii="Times New Roman" w:eastAsiaTheme="majorEastAsia" w:hAnsi="Times New Roman" w:cs="Times New Roman"/>
       <w:b/>
@@ -17993,7 +17993,7 @@
     <w:basedOn w:val="Fontepargpadro"/>
     <w:link w:val="Ttulo2"/>
     <w:uiPriority w:val="9"/>
-    <w:rsid w:val="009D44C9"/>
+    <w:rsid w:val="004E5EDB"/>
     <w:rPr>
       <w:rFonts w:ascii="Times New Roman" w:eastAsiaTheme="majorEastAsia" w:hAnsi="Times New Roman" w:cs="Times New Roman"/>
       <w:b/>
@@ -18007,7 +18007,7 @@
     <w:basedOn w:val="Fontepargpadro"/>
     <w:link w:val="Ttulo3"/>
     <w:uiPriority w:val="9"/>
-    <w:rsid w:val="009D44C9"/>
+    <w:rsid w:val="004E5EDB"/>
     <w:rPr>
       <w:rFonts w:ascii="Times New Roman" w:eastAsiaTheme="majorEastAsia" w:hAnsi="Times New Roman" w:cs="Times New Roman"/>
       <w:i/>
@@ -18024,7 +18024,7 @@
     <w:uiPriority w:val="99"/>
     <w:semiHidden/>
     <w:unhideWhenUsed/>
-    <w:rsid w:val="009D44C9"/>
+    <w:rsid w:val="004E5EDB"/>
     <w:pPr>
       <w:spacing w:line="240" w:lineRule="auto"/>
       <w:ind w:left="240" w:hanging="240"/>
@@ -18036,7 +18036,7 @@
     <w:next w:val="Remissivo1"/>
     <w:uiPriority w:val="99"/>
     <w:unhideWhenUsed/>
-    <w:rsid w:val="009D44C9"/>
+    <w:rsid w:val="004E5EDB"/>
     <w:pPr>
       <w:spacing w:line="240" w:lineRule="auto"/>
       <w:jc w:val="center"/>
@@ -18054,7 +18054,7 @@
     <w:link w:val="CabealhoChar"/>
     <w:uiPriority w:val="99"/>
     <w:unhideWhenUsed/>
-    <w:rsid w:val="009D44C9"/>
+    <w:rsid w:val="004E5EDB"/>
     <w:pPr>
       <w:tabs>
         <w:tab w:val="center" w:pos="4252"/>
@@ -18068,7 +18068,7 @@
     <w:basedOn w:val="Fontepargpadro"/>
     <w:link w:val="Cabealho"/>
     <w:uiPriority w:val="99"/>
-    <w:rsid w:val="009D44C9"/>
+    <w:rsid w:val="004E5EDB"/>
     <w:rPr>
       <w:rFonts w:ascii="Times New Roman" w:hAnsi="Times New Roman" w:cs="Times New Roman"/>
       <w:sz w:val="24"/>
@@ -18080,7 +18080,7 @@
     <w:link w:val="RodapChar"/>
     <w:uiPriority w:val="99"/>
     <w:unhideWhenUsed/>
-    <w:rsid w:val="009D44C9"/>
+    <w:rsid w:val="004E5EDB"/>
     <w:pPr>
       <w:tabs>
         <w:tab w:val="center" w:pos="4252"/>
@@ -18094,7 +18094,7 @@
     <w:basedOn w:val="Fontepargpadro"/>
     <w:link w:val="Rodap"/>
     <w:uiPriority w:val="99"/>
-    <w:rsid w:val="009D44C9"/>
+    <w:rsid w:val="004E5EDB"/>
     <w:rPr>
       <w:rFonts w:ascii="Times New Roman" w:hAnsi="Times New Roman" w:cs="Times New Roman"/>
       <w:sz w:val="24"/>
@@ -18107,7 +18107,7 @@
     <w:autoRedefine/>
     <w:uiPriority w:val="39"/>
     <w:unhideWhenUsed/>
-    <w:rsid w:val="009D44C9"/>
+    <w:rsid w:val="004E5EDB"/>
     <w:pPr>
       <w:spacing w:after="100"/>
     </w:pPr>
@@ -18119,7 +18119,7 @@
     <w:autoRedefine/>
     <w:uiPriority w:val="39"/>
     <w:unhideWhenUsed/>
-    <w:rsid w:val="009D44C9"/>
+    <w:rsid w:val="004E5EDB"/>
     <w:pPr>
       <w:spacing w:after="100"/>
       <w:ind w:left="240"/>

</xml_diff>